<commit_message>
Use parent bailleur in avenant document
</commit_message>
<xml_diff>
--- a/documents/Avenant-template.docx
+++ b/documents/Avenant-template.docx
@@ -245,7 +245,25 @@
         <w:rPr>
           <w:rFonts w:cs="TimesNewRomanPSMT"/>
         </w:rPr>
-        <w:t>convention.identification_bailleur</w:t>
+        <w:t>parent_</w:t>
+      </w:r>
+      <w:r>
+        <w:rPr>
+          <w:rFonts w:cs="TimesNewRomanPSMT"/>
+        </w:rPr>
+        <w:t>convention</w:t>
+      </w:r>
+      <w:r>
+        <w:rPr>
+          <w:rFonts w:cs="TimesNewRomanPSMT"/>
+        </w:rPr>
+        <w:t>.</w:t>
+      </w:r>
+      <w:r>
+        <w:rPr>
+          <w:rFonts w:cs="TimesNewRomanPSMT"/>
+        </w:rPr>
+        <w:t>identification_bailleur</w:t>
       </w:r>
       <w:proofErr w:type="spellEnd"/>
       <w:r>
@@ -261,6 +279,12 @@
         <w:t xml:space="preserve">{{ </w:t>
       </w:r>
       <w:proofErr w:type="spellStart"/>
+      <w:r>
+        <w:rPr>
+          <w:rFonts w:cs="TimesNewRomanPSMT"/>
+        </w:rPr>
+        <w:t>parent_</w:t>
+      </w:r>
       <w:r>
         <w:rPr>
           <w:rFonts w:cs="TimesNewRomanPSMT"/>
@@ -287,6 +311,12 @@
         <w:rPr>
           <w:rFonts w:cs="TimesNewRomanPSMT"/>
         </w:rPr>
+        <w:t>parent_</w:t>
+      </w:r>
+      <w:r>
+        <w:rPr>
+          <w:rFonts w:cs="TimesNewRomanPSMT"/>
+        </w:rPr>
         <w:t>convention.signataire_nom</w:t>
       </w:r>
       <w:proofErr w:type="spellEnd"/>
@@ -309,6 +339,12 @@
         <w:rPr>
           <w:rFonts w:cs="TimesNewRomanPSMT"/>
         </w:rPr>
+        <w:t>parent_</w:t>
+      </w:r>
+      <w:r>
+        <w:rPr>
+          <w:rFonts w:cs="TimesNewRomanPSMT"/>
+        </w:rPr>
         <w:t>convention.signataire_fonction</w:t>
       </w:r>
       <w:proofErr w:type="spellEnd"/>
@@ -331,6 +367,12 @@
         <w:rPr>
           <w:rFonts w:cs="TimesNewRomanPSMT"/>
         </w:rPr>
+        <w:t>parent_</w:t>
+      </w:r>
+      <w:r>
+        <w:rPr>
+          <w:rFonts w:cs="TimesNewRomanPSMT"/>
+        </w:rPr>
         <w:t>convention.signataire_date_deliberation|d</w:t>
       </w:r>
       <w:proofErr w:type="spellEnd"/>
@@ -353,6 +395,12 @@
         <w:rPr>
           <w:rFonts w:cs="TimesNewRomanPSMT"/>
         </w:rPr>
+        <w:t>parent_</w:t>
+      </w:r>
+      <w:r>
+        <w:rPr>
+          <w:rFonts w:cs="TimesNewRomanPSMT"/>
+        </w:rPr>
         <w:t>bailleur.siret</w:t>
       </w:r>
       <w:proofErr w:type="spellEnd"/>
@@ -363,6 +411,12 @@
         <w:t xml:space="preserve"> }}{% if </w:t>
       </w:r>
       <w:proofErr w:type="spellStart"/>
+      <w:r>
+        <w:rPr>
+          <w:rFonts w:cs="TimesNewRomanPSMT"/>
+        </w:rPr>
+        <w:t>parent_</w:t>
+      </w:r>
       <w:r>
         <w:rPr>
           <w:rFonts w:cs="TimesNewRomanPSMT"/>
@@ -389,6 +443,12 @@
         <w:rPr>
           <w:rFonts w:cs="TimesNewRomanPSMT"/>
         </w:rPr>
+        <w:t>parent_</w:t>
+      </w:r>
+      <w:r>
+        <w:rPr>
+          <w:rFonts w:cs="TimesNewRomanPSMT"/>
+        </w:rPr>
         <w:t>bailleur.capital_social|f</w:t>
       </w:r>
       <w:proofErr w:type="spellEnd"/>
@@ -425,6 +485,12 @@
         <w:rPr>
           <w:rFonts w:cs="TimesNewRomanPSMT"/>
         </w:rPr>
+        <w:t>parent_</w:t>
+      </w:r>
+      <w:r>
+        <w:rPr>
+          <w:rFonts w:cs="TimesNewRomanPSMT"/>
+        </w:rPr>
         <w:t>bailleur.adresse</w:t>
       </w:r>
       <w:proofErr w:type="spellEnd"/>
@@ -439,6 +505,12 @@
         <w:rPr>
           <w:rFonts w:cs="TimesNewRomanPSMT"/>
         </w:rPr>
+        <w:t>parent_</w:t>
+      </w:r>
+      <w:r>
+        <w:rPr>
+          <w:rFonts w:cs="TimesNewRomanPSMT"/>
+        </w:rPr>
         <w:t>bailleur.code_postal</w:t>
       </w:r>
       <w:proofErr w:type="spellEnd"/>
@@ -453,6 +525,12 @@
         <w:rPr>
           <w:rFonts w:cs="TimesNewRomanPSMT"/>
         </w:rPr>
+        <w:t>parent_</w:t>
+      </w:r>
+      <w:r>
+        <w:rPr>
+          <w:rFonts w:cs="TimesNewRomanPSMT"/>
+        </w:rPr>
         <w:t>bailleur.ville</w:t>
       </w:r>
       <w:proofErr w:type="spellEnd"/>
@@ -495,6 +573,12 @@
         <w:t xml:space="preserve"> </w:t>
       </w:r>
       <w:proofErr w:type="spellStart"/>
+      <w:r>
+        <w:rPr>
+          <w:rFonts w:cs="TimesNewRomanPSMT"/>
+        </w:rPr>
+        <w:t>parent_</w:t>
+      </w:r>
       <w:r>
         <w:rPr>
           <w:rFonts w:cs="TimesNewRomanPSMT"/>
@@ -754,6 +838,7 @@
         </w:rPr>
       </w:pPr>
       <w:r>
+        <w:lastRenderedPageBreak/>
         <w:br w:type="page"/>
       </w:r>
     </w:p>
@@ -2092,80 +2177,76 @@
       <w:pPr>
         <w:ind w:firstLine="708"/>
         <w:jc w:val="both"/>
+        <w:rPr>
+          <w:lang w:val="en-US"/>
+        </w:rPr>
       </w:pPr>
       <w:r>
         <w:rPr>
           <w:rFonts w:cs="TimesNewRomanPSMT"/>
           <w:sz w:val="16"/>
           <w:szCs w:val="16"/>
-        </w:rPr>
-        <w:t xml:space="preserve">{%- </w:t>
-      </w:r>
-      <w:proofErr w:type="spellStart"/>
+          <w:lang w:val="en-US"/>
+        </w:rPr>
+        <w:t xml:space="preserve">{%- endif %} </w:t>
+      </w:r>
+    </w:p>
+    <w:p>
+      <w:pPr>
+        <w:ind w:firstLine="708"/>
+        <w:jc w:val="both"/>
+        <w:rPr>
+          <w:lang w:val="en-US"/>
+        </w:rPr>
+      </w:pPr>
       <w:r>
         <w:rPr>
           <w:rFonts w:cs="TimesNewRomanPSMT"/>
           <w:sz w:val="16"/>
           <w:szCs w:val="16"/>
-        </w:rPr>
-        <w:t>endif</w:t>
-      </w:r>
-      <w:proofErr w:type="spellEnd"/>
+          <w:lang w:val="en-US"/>
+        </w:rPr>
+        <w:t xml:space="preserve">{%- if </w:t>
+      </w:r>
+      <w:proofErr w:type="spellStart"/>
+      <w:proofErr w:type="gramStart"/>
       <w:r>
         <w:rPr>
           <w:rFonts w:cs="TimesNewRomanPSMT"/>
           <w:sz w:val="16"/>
           <w:szCs w:val="16"/>
-        </w:rPr>
-        <w:t xml:space="preserve"> %} </w:t>
+          <w:lang w:val="en-US"/>
+        </w:rPr>
+        <w:t>lot.annexe</w:t>
+      </w:r>
+      <w:proofErr w:type="gramEnd"/>
+      <w:r>
+        <w:rPr>
+          <w:rFonts w:cs="TimesNewRomanPSMT"/>
+          <w:sz w:val="16"/>
+          <w:szCs w:val="16"/>
+          <w:lang w:val="en-US"/>
+        </w:rPr>
+        <w:t>_remises</w:t>
+      </w:r>
+      <w:proofErr w:type="spellEnd"/>
+      <w:r>
+        <w:rPr>
+          <w:rFonts w:cs="TimesNewRomanPSMT"/>
+          <w:sz w:val="16"/>
+          <w:szCs w:val="16"/>
+          <w:lang w:val="en-US"/>
+        </w:rPr>
+        <w:t xml:space="preserve"> %}</w:t>
       </w:r>
     </w:p>
     <w:p>
       <w:pPr>
         <w:ind w:firstLine="708"/>
         <w:jc w:val="both"/>
-      </w:pPr>
-      <w:r>
-        <w:rPr>
-          <w:rFonts w:cs="TimesNewRomanPSMT"/>
-          <w:sz w:val="16"/>
-          <w:szCs w:val="16"/>
-        </w:rPr>
-        <w:t xml:space="preserve">{%- if </w:t>
-      </w:r>
-      <w:proofErr w:type="spellStart"/>
-      <w:proofErr w:type="gramStart"/>
-      <w:r>
-        <w:rPr>
-          <w:rFonts w:cs="TimesNewRomanPSMT"/>
-          <w:sz w:val="16"/>
-          <w:szCs w:val="16"/>
-        </w:rPr>
-        <w:t>lot.annexe</w:t>
-      </w:r>
-      <w:proofErr w:type="gramEnd"/>
-      <w:r>
-        <w:rPr>
-          <w:rFonts w:cs="TimesNewRomanPSMT"/>
-          <w:sz w:val="16"/>
-          <w:szCs w:val="16"/>
-        </w:rPr>
-        <w:t>_remises</w:t>
-      </w:r>
-      <w:proofErr w:type="spellEnd"/>
-      <w:r>
-        <w:rPr>
-          <w:rFonts w:cs="TimesNewRomanPSMT"/>
-          <w:sz w:val="16"/>
-          <w:szCs w:val="16"/>
-        </w:rPr>
-        <w:t xml:space="preserve"> %}</w:t>
-      </w:r>
-    </w:p>
-    <w:p>
-      <w:pPr>
-        <w:ind w:firstLine="708"/>
-        <w:jc w:val="both"/>
+        <w:rPr>
+          <w:lang w:val="en-US"/>
+        </w:rPr>
       </w:pPr>
       <w:r>
         <w:fldChar w:fldCharType="begin">
@@ -2185,6 +2266,7 @@
         <w:rPr>
           <w:sz w:val="16"/>
           <w:szCs w:val="16"/>
+          <w:lang w:val="en-US"/>
         </w:rPr>
         <w:instrText xml:space="preserve"> FORMCHECKBOX </w:instrText>
       </w:r>
@@ -2215,12 +2297,14 @@
           <w:rFonts w:cs="TimesNewRomanPSMT"/>
           <w:sz w:val="16"/>
           <w:szCs w:val="16"/>
+          <w:lang w:val="en-US"/>
         </w:rPr>
         <w:t xml:space="preserve"> </w:t>
       </w:r>
       <w:r>
         <w:rPr>
           <w:rFonts w:cs="TimesNewRomanPSMT"/>
+          <w:lang w:val="en-US"/>
         </w:rPr>
         <w:t>Remise</w:t>
       </w:r>
@@ -2229,80 +2313,76 @@
       <w:pPr>
         <w:ind w:firstLine="708"/>
         <w:jc w:val="both"/>
+        <w:rPr>
+          <w:lang w:val="en-US"/>
+        </w:rPr>
       </w:pPr>
       <w:r>
         <w:rPr>
           <w:rFonts w:cs="TimesNewRomanPSMT"/>
           <w:sz w:val="16"/>
           <w:szCs w:val="16"/>
-        </w:rPr>
-        <w:t xml:space="preserve">{%- </w:t>
-      </w:r>
-      <w:proofErr w:type="spellStart"/>
+          <w:lang w:val="en-US"/>
+        </w:rPr>
+        <w:t xml:space="preserve">{%- endif %} </w:t>
+      </w:r>
+    </w:p>
+    <w:p>
+      <w:pPr>
+        <w:ind w:firstLine="708"/>
+        <w:jc w:val="both"/>
+        <w:rPr>
+          <w:lang w:val="en-US"/>
+        </w:rPr>
+      </w:pPr>
       <w:r>
         <w:rPr>
           <w:rFonts w:cs="TimesNewRomanPSMT"/>
           <w:sz w:val="16"/>
           <w:szCs w:val="16"/>
-        </w:rPr>
-        <w:t>endif</w:t>
-      </w:r>
-      <w:proofErr w:type="spellEnd"/>
+          <w:lang w:val="en-US"/>
+        </w:rPr>
+        <w:t xml:space="preserve">{%- if </w:t>
+      </w:r>
+      <w:proofErr w:type="spellStart"/>
+      <w:proofErr w:type="gramStart"/>
       <w:r>
         <w:rPr>
           <w:rFonts w:cs="TimesNewRomanPSMT"/>
           <w:sz w:val="16"/>
           <w:szCs w:val="16"/>
-        </w:rPr>
-        <w:t xml:space="preserve"> %} </w:t>
+          <w:lang w:val="en-US"/>
+        </w:rPr>
+        <w:t>lot.annexe</w:t>
+      </w:r>
+      <w:proofErr w:type="gramEnd"/>
+      <w:r>
+        <w:rPr>
+          <w:rFonts w:cs="TimesNewRomanPSMT"/>
+          <w:sz w:val="16"/>
+          <w:szCs w:val="16"/>
+          <w:lang w:val="en-US"/>
+        </w:rPr>
+        <w:t>_ateliers</w:t>
+      </w:r>
+      <w:proofErr w:type="spellEnd"/>
+      <w:r>
+        <w:rPr>
+          <w:rFonts w:cs="TimesNewRomanPSMT"/>
+          <w:sz w:val="16"/>
+          <w:szCs w:val="16"/>
+          <w:lang w:val="en-US"/>
+        </w:rPr>
+        <w:t xml:space="preserve"> %}</w:t>
       </w:r>
     </w:p>
     <w:p>
       <w:pPr>
         <w:ind w:firstLine="708"/>
         <w:jc w:val="both"/>
-      </w:pPr>
-      <w:r>
-        <w:rPr>
-          <w:rFonts w:cs="TimesNewRomanPSMT"/>
-          <w:sz w:val="16"/>
-          <w:szCs w:val="16"/>
-        </w:rPr>
-        <w:t xml:space="preserve">{%- if </w:t>
-      </w:r>
-      <w:proofErr w:type="spellStart"/>
-      <w:proofErr w:type="gramStart"/>
-      <w:r>
-        <w:rPr>
-          <w:rFonts w:cs="TimesNewRomanPSMT"/>
-          <w:sz w:val="16"/>
-          <w:szCs w:val="16"/>
-        </w:rPr>
-        <w:t>lot.annexe</w:t>
-      </w:r>
-      <w:proofErr w:type="gramEnd"/>
-      <w:r>
-        <w:rPr>
-          <w:rFonts w:cs="TimesNewRomanPSMT"/>
-          <w:sz w:val="16"/>
-          <w:szCs w:val="16"/>
-        </w:rPr>
-        <w:t>_ateliers</w:t>
-      </w:r>
-      <w:proofErr w:type="spellEnd"/>
-      <w:r>
-        <w:rPr>
-          <w:rFonts w:cs="TimesNewRomanPSMT"/>
-          <w:sz w:val="16"/>
-          <w:szCs w:val="16"/>
-        </w:rPr>
-        <w:t xml:space="preserve"> %}</w:t>
-      </w:r>
-    </w:p>
-    <w:p>
-      <w:pPr>
-        <w:ind w:firstLine="708"/>
-        <w:jc w:val="both"/>
+        <w:rPr>
+          <w:lang w:val="en-US"/>
+        </w:rPr>
       </w:pPr>
       <w:r>
         <w:fldChar w:fldCharType="begin">
@@ -2322,6 +2402,7 @@
         <w:rPr>
           <w:sz w:val="16"/>
           <w:szCs w:val="16"/>
+          <w:lang w:val="en-US"/>
         </w:rPr>
         <w:instrText xml:space="preserve"> FORMCHECKBOX </w:instrText>
       </w:r>
@@ -2352,12 +2433,14 @@
           <w:rFonts w:cs="TimesNewRomanPSMT"/>
           <w:sz w:val="16"/>
           <w:szCs w:val="16"/>
+          <w:lang w:val="en-US"/>
         </w:rPr>
         <w:t xml:space="preserve"> </w:t>
       </w:r>
       <w:r>
         <w:rPr>
           <w:rFonts w:cs="TimesNewRomanPSMT"/>
+          <w:lang w:val="en-US"/>
         </w:rPr>
         <w:t>Ateliers</w:t>
       </w:r>
@@ -2366,80 +2449,76 @@
       <w:pPr>
         <w:ind w:firstLine="708"/>
         <w:jc w:val="both"/>
+        <w:rPr>
+          <w:lang w:val="en-US"/>
+        </w:rPr>
       </w:pPr>
       <w:r>
         <w:rPr>
           <w:rFonts w:cs="TimesNewRomanPSMT"/>
           <w:sz w:val="16"/>
           <w:szCs w:val="16"/>
-        </w:rPr>
-        <w:t xml:space="preserve">{%- </w:t>
-      </w:r>
-      <w:proofErr w:type="spellStart"/>
+          <w:lang w:val="en-US"/>
+        </w:rPr>
+        <w:t xml:space="preserve">{%- endif %} </w:t>
+      </w:r>
+    </w:p>
+    <w:p>
+      <w:pPr>
+        <w:ind w:firstLine="708"/>
+        <w:jc w:val="both"/>
+        <w:rPr>
+          <w:lang w:val="en-US"/>
+        </w:rPr>
+      </w:pPr>
       <w:r>
         <w:rPr>
           <w:rFonts w:cs="TimesNewRomanPSMT"/>
           <w:sz w:val="16"/>
           <w:szCs w:val="16"/>
-        </w:rPr>
-        <w:t>endif</w:t>
-      </w:r>
-      <w:proofErr w:type="spellEnd"/>
+          <w:lang w:val="en-US"/>
+        </w:rPr>
+        <w:t xml:space="preserve">{%- if </w:t>
+      </w:r>
+      <w:proofErr w:type="spellStart"/>
+      <w:proofErr w:type="gramStart"/>
       <w:r>
         <w:rPr>
           <w:rFonts w:cs="TimesNewRomanPSMT"/>
           <w:sz w:val="16"/>
           <w:szCs w:val="16"/>
-        </w:rPr>
-        <w:t xml:space="preserve"> %} </w:t>
+          <w:lang w:val="en-US"/>
+        </w:rPr>
+        <w:t>lot.annexe</w:t>
+      </w:r>
+      <w:proofErr w:type="gramEnd"/>
+      <w:r>
+        <w:rPr>
+          <w:rFonts w:cs="TimesNewRomanPSMT"/>
+          <w:sz w:val="16"/>
+          <w:szCs w:val="16"/>
+          <w:lang w:val="en-US"/>
+        </w:rPr>
+        <w:t>_sechoirs</w:t>
+      </w:r>
+      <w:proofErr w:type="spellEnd"/>
+      <w:r>
+        <w:rPr>
+          <w:rFonts w:cs="TimesNewRomanPSMT"/>
+          <w:sz w:val="16"/>
+          <w:szCs w:val="16"/>
+          <w:lang w:val="en-US"/>
+        </w:rPr>
+        <w:t xml:space="preserve"> %}</w:t>
       </w:r>
     </w:p>
     <w:p>
       <w:pPr>
         <w:ind w:firstLine="708"/>
         <w:jc w:val="both"/>
-      </w:pPr>
-      <w:r>
-        <w:rPr>
-          <w:rFonts w:cs="TimesNewRomanPSMT"/>
-          <w:sz w:val="16"/>
-          <w:szCs w:val="16"/>
-        </w:rPr>
-        <w:t xml:space="preserve">{%- if </w:t>
-      </w:r>
-      <w:proofErr w:type="spellStart"/>
-      <w:proofErr w:type="gramStart"/>
-      <w:r>
-        <w:rPr>
-          <w:rFonts w:cs="TimesNewRomanPSMT"/>
-          <w:sz w:val="16"/>
-          <w:szCs w:val="16"/>
-        </w:rPr>
-        <w:t>lot.annexe</w:t>
-      </w:r>
-      <w:proofErr w:type="gramEnd"/>
-      <w:r>
-        <w:rPr>
-          <w:rFonts w:cs="TimesNewRomanPSMT"/>
-          <w:sz w:val="16"/>
-          <w:szCs w:val="16"/>
-        </w:rPr>
-        <w:t>_sechoirs</w:t>
-      </w:r>
-      <w:proofErr w:type="spellEnd"/>
-      <w:r>
-        <w:rPr>
-          <w:rFonts w:cs="TimesNewRomanPSMT"/>
-          <w:sz w:val="16"/>
-          <w:szCs w:val="16"/>
-        </w:rPr>
-        <w:t xml:space="preserve"> %}</w:t>
-      </w:r>
-    </w:p>
-    <w:p>
-      <w:pPr>
-        <w:ind w:firstLine="708"/>
-        <w:jc w:val="both"/>
+        <w:rPr>
+          <w:lang w:val="en-US"/>
+        </w:rPr>
       </w:pPr>
       <w:r>
         <w:fldChar w:fldCharType="begin">
@@ -2459,6 +2538,7 @@
         <w:rPr>
           <w:sz w:val="16"/>
           <w:szCs w:val="16"/>
+          <w:lang w:val="en-US"/>
         </w:rPr>
         <w:instrText xml:space="preserve"> FORMCHECKBOX </w:instrText>
       </w:r>
@@ -2489,86 +2569,83 @@
           <w:rFonts w:cs="TimesNewRomanPSMT"/>
           <w:sz w:val="16"/>
           <w:szCs w:val="16"/>
+          <w:lang w:val="en-US"/>
         </w:rPr>
         <w:t xml:space="preserve"> </w:t>
       </w:r>
-      <w:r>
-        <w:rPr>
-          <w:rFonts w:cs="TimesNewRomanPSMT"/>
+      <w:proofErr w:type="spellStart"/>
+      <w:r>
+        <w:rPr>
+          <w:rFonts w:cs="TimesNewRomanPSMT"/>
+          <w:lang w:val="en-US"/>
         </w:rPr>
         <w:t>Séchoirs</w:t>
       </w:r>
+      <w:proofErr w:type="spellEnd"/>
     </w:p>
     <w:p>
       <w:pPr>
         <w:ind w:firstLine="708"/>
         <w:jc w:val="both"/>
+        <w:rPr>
+          <w:lang w:val="en-US"/>
+        </w:rPr>
       </w:pPr>
       <w:r>
         <w:rPr>
           <w:rFonts w:cs="TimesNewRomanPSMT"/>
           <w:sz w:val="16"/>
           <w:szCs w:val="16"/>
-        </w:rPr>
-        <w:t xml:space="preserve">{%- </w:t>
-      </w:r>
-      <w:proofErr w:type="spellStart"/>
+          <w:lang w:val="en-US"/>
+        </w:rPr>
+        <w:t xml:space="preserve">{%- endif %} </w:t>
+      </w:r>
+    </w:p>
+    <w:p>
+      <w:pPr>
+        <w:ind w:firstLine="708"/>
+        <w:jc w:val="both"/>
+        <w:rPr>
+          <w:lang w:val="en-US"/>
+        </w:rPr>
+      </w:pPr>
       <w:r>
         <w:rPr>
           <w:rFonts w:cs="TimesNewRomanPSMT"/>
           <w:sz w:val="16"/>
           <w:szCs w:val="16"/>
-        </w:rPr>
-        <w:t>endif</w:t>
-      </w:r>
-      <w:proofErr w:type="spellEnd"/>
+          <w:lang w:val="en-US"/>
+        </w:rPr>
+        <w:t xml:space="preserve">{%- if </w:t>
+      </w:r>
+      <w:proofErr w:type="spellStart"/>
+      <w:proofErr w:type="gramStart"/>
       <w:r>
         <w:rPr>
           <w:rFonts w:cs="TimesNewRomanPSMT"/>
           <w:sz w:val="16"/>
           <w:szCs w:val="16"/>
-        </w:rPr>
-        <w:t xml:space="preserve"> %} </w:t>
-      </w:r>
-    </w:p>
-    <w:p>
-      <w:pPr>
-        <w:ind w:firstLine="708"/>
-        <w:jc w:val="both"/>
-      </w:pPr>
+          <w:lang w:val="en-US"/>
+        </w:rPr>
+        <w:t>lot.annexe</w:t>
+      </w:r>
+      <w:proofErr w:type="gramEnd"/>
       <w:r>
         <w:rPr>
           <w:rFonts w:cs="TimesNewRomanPSMT"/>
           <w:sz w:val="16"/>
           <w:szCs w:val="16"/>
-        </w:rPr>
-        <w:t xml:space="preserve">{%- if </w:t>
-      </w:r>
-      <w:proofErr w:type="spellStart"/>
-      <w:proofErr w:type="gramStart"/>
+          <w:lang w:val="en-US"/>
+        </w:rPr>
+        <w:t>_celliers</w:t>
+      </w:r>
+      <w:proofErr w:type="spellEnd"/>
       <w:r>
         <w:rPr>
           <w:rFonts w:cs="TimesNewRomanPSMT"/>
           <w:sz w:val="16"/>
           <w:szCs w:val="16"/>
-        </w:rPr>
-        <w:t>lot.annexe</w:t>
-      </w:r>
-      <w:proofErr w:type="gramEnd"/>
-      <w:r>
-        <w:rPr>
-          <w:rFonts w:cs="TimesNewRomanPSMT"/>
-          <w:sz w:val="16"/>
-          <w:szCs w:val="16"/>
-        </w:rPr>
-        <w:t>_celliers</w:t>
-      </w:r>
-      <w:proofErr w:type="spellEnd"/>
-      <w:r>
-        <w:rPr>
-          <w:rFonts w:cs="TimesNewRomanPSMT"/>
-          <w:sz w:val="16"/>
-          <w:szCs w:val="16"/>
+          <w:lang w:val="en-US"/>
         </w:rPr>
         <w:t xml:space="preserve"> %}</w:t>
       </w:r>
@@ -2672,12 +2749,16 @@
       <w:pPr>
         <w:ind w:firstLine="708"/>
         <w:jc w:val="both"/>
+        <w:rPr>
+          <w:lang w:val="en-US"/>
+        </w:rPr>
       </w:pPr>
       <w:r>
         <w:rPr>
           <w:rFonts w:cs="TimesNewRomanPSMT"/>
           <w:sz w:val="16"/>
           <w:szCs w:val="16"/>
+          <w:lang w:val="en-US"/>
         </w:rPr>
         <w:t xml:space="preserve">{%- if </w:t>
       </w:r>
@@ -2688,6 +2769,7 @@
           <w:rFonts w:cs="TimesNewRomanPSMT"/>
           <w:sz w:val="16"/>
           <w:szCs w:val="16"/>
+          <w:lang w:val="en-US"/>
         </w:rPr>
         <w:t>lot.annexe</w:t>
       </w:r>
@@ -2697,6 +2779,7 @@
           <w:rFonts w:cs="TimesNewRomanPSMT"/>
           <w:sz w:val="16"/>
           <w:szCs w:val="16"/>
+          <w:lang w:val="en-US"/>
         </w:rPr>
         <w:t>_resserres</w:t>
       </w:r>
@@ -2706,6 +2789,7 @@
           <w:rFonts w:cs="TimesNewRomanPSMT"/>
           <w:sz w:val="16"/>
           <w:szCs w:val="16"/>
+          <w:lang w:val="en-US"/>
         </w:rPr>
         <w:t xml:space="preserve"> %}</w:t>
       </w:r>
@@ -2714,6 +2798,9 @@
       <w:pPr>
         <w:ind w:firstLine="708"/>
         <w:jc w:val="both"/>
+        <w:rPr>
+          <w:lang w:val="en-US"/>
+        </w:rPr>
       </w:pPr>
       <w:r>
         <w:fldChar w:fldCharType="begin">
@@ -2733,6 +2820,7 @@
         <w:rPr>
           <w:sz w:val="16"/>
           <w:szCs w:val="16"/>
+          <w:lang w:val="en-US"/>
         </w:rPr>
         <w:instrText xml:space="preserve"> FORMCHECKBOX </w:instrText>
       </w:r>
@@ -2763,86 +2851,83 @@
           <w:rFonts w:cs="TimesNewRomanPSMT"/>
           <w:sz w:val="16"/>
           <w:szCs w:val="16"/>
+          <w:lang w:val="en-US"/>
         </w:rPr>
         <w:t xml:space="preserve"> </w:t>
       </w:r>
-      <w:r>
-        <w:rPr>
-          <w:rFonts w:cs="TimesNewRomanPSMT"/>
+      <w:proofErr w:type="spellStart"/>
+      <w:r>
+        <w:rPr>
+          <w:rFonts w:cs="TimesNewRomanPSMT"/>
+          <w:lang w:val="en-US"/>
         </w:rPr>
         <w:t>Resserres</w:t>
       </w:r>
+      <w:proofErr w:type="spellEnd"/>
     </w:p>
     <w:p>
       <w:pPr>
         <w:ind w:firstLine="708"/>
         <w:jc w:val="both"/>
+        <w:rPr>
+          <w:lang w:val="en-US"/>
+        </w:rPr>
       </w:pPr>
       <w:r>
         <w:rPr>
           <w:rFonts w:cs="TimesNewRomanPSMT"/>
           <w:sz w:val="16"/>
           <w:szCs w:val="16"/>
-        </w:rPr>
-        <w:t xml:space="preserve">{%- </w:t>
-      </w:r>
-      <w:proofErr w:type="spellStart"/>
+          <w:lang w:val="en-US"/>
+        </w:rPr>
+        <w:t xml:space="preserve">{%- endif %} </w:t>
+      </w:r>
+    </w:p>
+    <w:p>
+      <w:pPr>
+        <w:ind w:firstLine="708"/>
+        <w:jc w:val="both"/>
+        <w:rPr>
+          <w:lang w:val="en-US"/>
+        </w:rPr>
+      </w:pPr>
       <w:r>
         <w:rPr>
           <w:rFonts w:cs="TimesNewRomanPSMT"/>
           <w:sz w:val="16"/>
           <w:szCs w:val="16"/>
-        </w:rPr>
-        <w:t>endif</w:t>
-      </w:r>
-      <w:proofErr w:type="spellEnd"/>
+          <w:lang w:val="en-US"/>
+        </w:rPr>
+        <w:t xml:space="preserve">{%- if </w:t>
+      </w:r>
+      <w:proofErr w:type="spellStart"/>
+      <w:proofErr w:type="gramStart"/>
       <w:r>
         <w:rPr>
           <w:rFonts w:cs="TimesNewRomanPSMT"/>
           <w:sz w:val="16"/>
           <w:szCs w:val="16"/>
-        </w:rPr>
-        <w:t xml:space="preserve"> %} </w:t>
-      </w:r>
-    </w:p>
-    <w:p>
-      <w:pPr>
-        <w:ind w:firstLine="708"/>
-        <w:jc w:val="both"/>
-      </w:pPr>
+          <w:lang w:val="en-US"/>
+        </w:rPr>
+        <w:t>lot.annexe</w:t>
+      </w:r>
+      <w:proofErr w:type="gramEnd"/>
       <w:r>
         <w:rPr>
           <w:rFonts w:cs="TimesNewRomanPSMT"/>
           <w:sz w:val="16"/>
           <w:szCs w:val="16"/>
-        </w:rPr>
-        <w:t xml:space="preserve">{%- if </w:t>
-      </w:r>
-      <w:proofErr w:type="spellStart"/>
-      <w:proofErr w:type="gramStart"/>
+          <w:lang w:val="en-US"/>
+        </w:rPr>
+        <w:t>_combles</w:t>
+      </w:r>
+      <w:proofErr w:type="spellEnd"/>
       <w:r>
         <w:rPr>
           <w:rFonts w:cs="TimesNewRomanPSMT"/>
           <w:sz w:val="16"/>
           <w:szCs w:val="16"/>
-        </w:rPr>
-        <w:t>lot.annexe</w:t>
-      </w:r>
-      <w:proofErr w:type="gramEnd"/>
-      <w:r>
-        <w:rPr>
-          <w:rFonts w:cs="TimesNewRomanPSMT"/>
-          <w:sz w:val="16"/>
-          <w:szCs w:val="16"/>
-        </w:rPr>
-        <w:t>_combles</w:t>
-      </w:r>
-      <w:proofErr w:type="spellEnd"/>
-      <w:r>
-        <w:rPr>
-          <w:rFonts w:cs="TimesNewRomanPSMT"/>
-          <w:sz w:val="16"/>
-          <w:szCs w:val="16"/>
+          <w:lang w:val="en-US"/>
         </w:rPr>
         <w:t xml:space="preserve"> %}</w:t>
       </w:r>
@@ -2914,18 +2999,32 @@
       <w:pPr>
         <w:ind w:firstLine="708"/>
         <w:jc w:val="both"/>
-        <w:rPr>
-          <w:lang w:val="en-US"/>
-        </w:rPr>
       </w:pPr>
       <w:r>
         <w:rPr>
           <w:rFonts w:cs="TimesNewRomanPSMT"/>
           <w:sz w:val="16"/>
           <w:szCs w:val="16"/>
-          <w:lang w:val="en-US"/>
-        </w:rPr>
-        <w:t xml:space="preserve">{%- endif %} </w:t>
+        </w:rPr>
+        <w:t xml:space="preserve">{%- </w:t>
+      </w:r>
+      <w:proofErr w:type="spellStart"/>
+      <w:r>
+        <w:rPr>
+          <w:rFonts w:cs="TimesNewRomanPSMT"/>
+          <w:sz w:val="16"/>
+          <w:szCs w:val="16"/>
+        </w:rPr>
+        <w:t>endif</w:t>
+      </w:r>
+      <w:proofErr w:type="spellEnd"/>
+      <w:r>
+        <w:rPr>
+          <w:rFonts w:cs="TimesNewRomanPSMT"/>
+          <w:sz w:val="16"/>
+          <w:szCs w:val="16"/>
+        </w:rPr>
+        <w:t xml:space="preserve"> %} </w:t>
       </w:r>
     </w:p>
     <w:p>
@@ -3052,32 +3151,18 @@
       <w:pPr>
         <w:ind w:firstLine="708"/>
         <w:jc w:val="both"/>
+        <w:rPr>
+          <w:lang w:val="en-US"/>
+        </w:rPr>
       </w:pPr>
       <w:r>
         <w:rPr>
           <w:rFonts w:cs="TimesNewRomanPSMT"/>
           <w:sz w:val="16"/>
           <w:szCs w:val="16"/>
-        </w:rPr>
-        <w:t xml:space="preserve">{%- </w:t>
-      </w:r>
-      <w:proofErr w:type="spellStart"/>
-      <w:r>
-        <w:rPr>
-          <w:rFonts w:cs="TimesNewRomanPSMT"/>
-          <w:sz w:val="16"/>
-          <w:szCs w:val="16"/>
-        </w:rPr>
-        <w:t>endif</w:t>
-      </w:r>
-      <w:proofErr w:type="spellEnd"/>
-      <w:r>
-        <w:rPr>
-          <w:rFonts w:cs="TimesNewRomanPSMT"/>
-          <w:sz w:val="16"/>
-          <w:szCs w:val="16"/>
-        </w:rPr>
-        <w:t xml:space="preserve"> %} </w:t>
+          <w:lang w:val="en-US"/>
+        </w:rPr>
+        <w:t xml:space="preserve">{%- endif %} </w:t>
       </w:r>
     </w:p>
     <w:p>
@@ -4620,32 +4705,16 @@
           <w:sz w:val="20"/>
           <w:lang w:val="en-US"/>
         </w:rPr>
-        <w:t>logements</w:t>
-      </w:r>
+        <w:t>logements_sans_</w:t>
+      </w:r>
+      <w:proofErr w:type="gramStart"/>
       <w:r>
         <w:rPr>
           <w:rFonts w:cs="TimesNewRomanPSMT"/>
           <w:sz w:val="20"/>
           <w:lang w:val="en-US"/>
         </w:rPr>
-        <w:t>_sans_</w:t>
-      </w:r>
-      <w:proofErr w:type="gramStart"/>
-      <w:r>
-        <w:rPr>
-          <w:rFonts w:cs="TimesNewRomanPSMT"/>
-          <w:sz w:val="20"/>
-          <w:lang w:val="en-US"/>
-        </w:rPr>
-        <w:t>loyer</w:t>
-      </w:r>
-      <w:r>
-        <w:rPr>
-          <w:rFonts w:cs="TimesNewRomanPSMT"/>
-          <w:sz w:val="20"/>
-          <w:lang w:val="en-US"/>
-        </w:rPr>
-        <w:t>.count</w:t>
+        <w:t>loyer.count</w:t>
       </w:r>
       <w:proofErr w:type="spellEnd"/>
       <w:proofErr w:type="gramEnd"/>
@@ -5350,32 +5419,16 @@
           <w:sz w:val="20"/>
           <w:lang w:val="en-US"/>
         </w:rPr>
-        <w:t>logements</w:t>
-      </w:r>
+        <w:t>logements_</w:t>
+      </w:r>
+      <w:proofErr w:type="gramStart"/>
       <w:r>
         <w:rPr>
           <w:rFonts w:cs="TimesNewRomanPSMT"/>
           <w:sz w:val="20"/>
           <w:lang w:val="en-US"/>
         </w:rPr>
-        <w:t>_</w:t>
-      </w:r>
-      <w:proofErr w:type="gramStart"/>
-      <w:r>
-        <w:rPr>
-          <w:rFonts w:cs="TimesNewRomanPSMT"/>
-          <w:sz w:val="20"/>
-          <w:lang w:val="en-US"/>
-        </w:rPr>
-        <w:t>corrigee</w:t>
-      </w:r>
-      <w:r>
-        <w:rPr>
-          <w:rFonts w:cs="TimesNewRomanPSMT"/>
-          <w:sz w:val="20"/>
-          <w:lang w:val="en-US"/>
-        </w:rPr>
-        <w:t>.count</w:t>
+        <w:t>corrigee.count</w:t>
       </w:r>
       <w:proofErr w:type="spellEnd"/>
       <w:proofErr w:type="gramEnd"/>
@@ -6590,32 +6643,16 @@
           <w:sz w:val="20"/>
           <w:lang w:val="en-US"/>
         </w:rPr>
-        <w:t>logements</w:t>
-      </w:r>
+        <w:t>logements_corrigee_sans_</w:t>
+      </w:r>
+      <w:proofErr w:type="gramStart"/>
       <w:r>
         <w:rPr>
           <w:rFonts w:cs="TimesNewRomanPSMT"/>
           <w:sz w:val="20"/>
           <w:lang w:val="en-US"/>
         </w:rPr>
-        <w:t>_corrigee_sans_</w:t>
-      </w:r>
-      <w:proofErr w:type="gramStart"/>
-      <w:r>
-        <w:rPr>
-          <w:rFonts w:cs="TimesNewRomanPSMT"/>
-          <w:sz w:val="20"/>
-          <w:lang w:val="en-US"/>
-        </w:rPr>
-        <w:t>loyer</w:t>
-      </w:r>
-      <w:r>
-        <w:rPr>
-          <w:rFonts w:cs="TimesNewRomanPSMT"/>
-          <w:sz w:val="20"/>
-          <w:lang w:val="en-US"/>
-        </w:rPr>
-        <w:t>.count</w:t>
+        <w:t>loyer.count</w:t>
       </w:r>
       <w:proofErr w:type="spellEnd"/>
       <w:proofErr w:type="gramEnd"/>
@@ -6779,23 +6816,7 @@
                 <w:sz w:val="14"/>
                 <w:szCs w:val="14"/>
               </w:rPr>
-              <w:t>SURFACE</w:t>
-            </w:r>
-            <w:r>
-              <w:rPr>
-                <w:rFonts w:cs="TimesNewRomanPSMT"/>
-                <w:sz w:val="14"/>
-                <w:szCs w:val="14"/>
-              </w:rPr>
-              <w:t xml:space="preserve"> </w:t>
-            </w:r>
-            <w:r>
-              <w:rPr>
-                <w:rFonts w:cs="TimesNewRomanPSMT"/>
-                <w:sz w:val="14"/>
-                <w:szCs w:val="14"/>
-              </w:rPr>
-              <w:t>CORRIGÉE</w:t>
+              <w:t>SURFACE CORRIGÉE</w:t>
             </w:r>
           </w:p>
           <w:p>
@@ -7103,25 +7124,7 @@
                 <w:szCs w:val="16"/>
                 <w:lang w:val="en-US"/>
               </w:rPr>
-              <w:t>l.s</w:t>
-            </w:r>
-            <w:r>
-              <w:rPr>
-                <w:rFonts w:cs="TimesNewRomanPSMT"/>
-                <w:sz w:val="16"/>
-                <w:szCs w:val="16"/>
-                <w:lang w:val="en-US"/>
-              </w:rPr>
-              <w:t>c</w:t>
-            </w:r>
-            <w:r>
-              <w:rPr>
-                <w:rFonts w:cs="TimesNewRomanPSMT"/>
-                <w:sz w:val="16"/>
-                <w:szCs w:val="16"/>
-                <w:lang w:val="en-US"/>
-              </w:rPr>
-              <w:t>|f</w:t>
+              <w:t>l.sc|f</w:t>
             </w:r>
             <w:proofErr w:type="spellEnd"/>
             <w:r>
@@ -7316,29 +7319,7 @@
                 <w:szCs w:val="16"/>
                 <w:lang w:val="en-US"/>
               </w:rPr>
-              <w:t>s</w:t>
-            </w:r>
-            <w:r>
-              <w:rPr>
-                <w:rFonts w:cs="TimesNewRomanPSMT"/>
-                <w:b/>
-                <w:bCs/>
-                <w:sz w:val="16"/>
-                <w:szCs w:val="16"/>
-                <w:lang w:val="en-US"/>
-              </w:rPr>
-              <w:t>c</w:t>
-            </w:r>
-            <w:r>
-              <w:rPr>
-                <w:rFonts w:cs="TimesNewRomanPSMT"/>
-                <w:b/>
-                <w:bCs/>
-                <w:sz w:val="16"/>
-                <w:szCs w:val="16"/>
-                <w:lang w:val="en-US"/>
-              </w:rPr>
-              <w:t>_totale|f</w:t>
+              <w:t>sc_totale|f</w:t>
             </w:r>
             <w:proofErr w:type="spellEnd"/>
             <w:r>
@@ -10356,7 +10337,7 @@
         <v:shape id="_x0000_s1028" alt="" style="position:absolute;left:0;text-align:left;margin-left:0;margin-top:0;width:50pt;height:50pt;z-index:251659264;visibility:hidden;mso-wrap-edited:f;mso-width-percent:0;mso-height-percent:0;mso-width-percent:0;mso-height-percent:0" coordsize="21600,21600" o:spt="100" adj="10800,,0" path="m,l21600,em,21600r21600,e">
           <v:stroke joinstyle="miter"/>
           <v:formulas/>
-          <v:path o:connecttype="custom" o:connectlocs="0,0;18667824,0;0,18667824;18667824,18667824" o:connectangles="0,0,0,0"/>
+          <v:path o:connecttype="custom" o:connectlocs="0,0;548799456,0;0,548799456;548799456,548799456" o:connectangles="0,0,0,0"/>
           <o:lock v:ext="edit" selection="t"/>
         </v:shape>
       </w:pict>
@@ -10367,7 +10348,7 @@
           <v:fill color2="gray"/>
           <v:stroke joinstyle="round"/>
           <v:formulas/>
-          <v:path textpathok="t" o:connecttype="custom" o:connectlocs="0,0;2147483646,0;0,7718193;2147483646,7718193" o:connectangles="0,0,0,0"/>
+          <v:path textpathok="t" o:connecttype="custom" o:connectlocs="0,0;2147483646,0;0,145897074;2147483646,145897074" o:connectangles="0,0,0,0"/>
           <v:textpath on="t" style="font-family:&quot;Times New Roman&quot;;font-size:1pt" fitshape="t" trim="t" string="{{ convention.display_not_validated_status() }}"/>
           <w10:wrap anchorx="margin" anchory="margin"/>
         </v:shape>
@@ -10574,7 +10555,7 @@
           <v:fill color2="gray"/>
           <v:stroke joinstyle="round"/>
           <v:formulas/>
-          <v:path textpathok="t" o:connecttype="custom" o:connectlocs="0,0;2147483646,0;0,7646341;2147483646,7646341" o:connectangles="0,0,0,0"/>
+          <v:path textpathok="t" o:connecttype="custom" o:connectlocs="0,0;2147483646,0;0,143864490;2147483646,143864490" o:connectangles="0,0,0,0"/>
           <v:textpath on="t" style="font-family:&quot;Times New Roman&quot;;font-size:1pt" fitshape="t" trim="t" string="{{ convention.display_not_validated_status() }}"/>
           <w10:wrap anchorx="margin" anchory="margin"/>
         </v:shape>
@@ -11395,7 +11376,7 @@
           <v:fill color2="gray"/>
           <v:stroke joinstyle="round"/>
           <v:formulas/>
-          <v:path textpathok="t" o:connecttype="custom" o:connectlocs="0,0;2147483646,0;0,7646341;2147483646,7646341" o:connectangles="0,0,0,0"/>
+          <v:path textpathok="t" o:connecttype="custom" o:connectlocs="0,0;2147483646,0;0,143864490;2147483646,143864490" o:connectangles="0,0,0,0"/>
           <v:textpath on="t" style="font-family:&quot;Times New Roman&quot;;font-size:1pt" fitshape="t" trim="t" string="{{ convention.display_not_validated_status() }}"/>
           <w10:wrap anchorx="margin" anchory="margin"/>
         </v:shape>

</xml_diff>

<commit_message>
S1092: Avenants : ajouter la page de collationnement
</commit_message>
<xml_diff>
--- a/documents/Avenant-template.docx
+++ b/documents/Avenant-template.docx
@@ -1690,7 +1690,7 @@
     </w:p>
     <w:tbl>
       <w:tblPr>
-        <w:tblStyle w:val="Grilledutableau"/>
+        <w:tblStyle w:val="TableGrid"/>
         <w:tblW w:w="8268" w:type="dxa"/>
         <w:tblLayout w:type="fixed"/>
         <w:tblLook w:val="04A0" w:firstRow="1" w:lastRow="0" w:firstColumn="1" w:lastColumn="0" w:noHBand="0" w:noVBand="1"/>
@@ -3691,7 +3691,7 @@
     </w:p>
     <w:tbl>
       <w:tblPr>
-        <w:tblStyle w:val="Grilledutableau"/>
+        <w:tblStyle w:val="TableGrid"/>
         <w:tblW w:w="8270" w:type="dxa"/>
         <w:tblLayout w:type="fixed"/>
         <w:tblLook w:val="04A0" w:firstRow="1" w:lastRow="0" w:firstColumn="1" w:lastColumn="0" w:noHBand="0" w:noVBand="1"/>
@@ -4827,7 +4827,7 @@
     </w:p>
     <w:tbl>
       <w:tblPr>
-        <w:tblStyle w:val="Grilledutableau"/>
+        <w:tblStyle w:val="TableGrid"/>
         <w:tblW w:w="4815" w:type="dxa"/>
         <w:tblLayout w:type="fixed"/>
         <w:tblLook w:val="04A0" w:firstRow="1" w:lastRow="0" w:firstColumn="1" w:lastColumn="0" w:noHBand="0" w:noVBand="1"/>
@@ -5540,7 +5540,7 @@
     </w:p>
     <w:tbl>
       <w:tblPr>
-        <w:tblStyle w:val="Grilledutableau"/>
+        <w:tblStyle w:val="TableGrid"/>
         <w:tblW w:w="8270" w:type="dxa"/>
         <w:tblLayout w:type="fixed"/>
         <w:tblLook w:val="04A0" w:firstRow="1" w:lastRow="0" w:firstColumn="1" w:lastColumn="0" w:noHBand="0" w:noVBand="1"/>
@@ -6764,7 +6764,7 @@
     </w:p>
     <w:tbl>
       <w:tblPr>
-        <w:tblStyle w:val="Grilledutableau"/>
+        <w:tblStyle w:val="TableGrid"/>
         <w:tblW w:w="4815" w:type="dxa"/>
         <w:tblLayout w:type="fixed"/>
         <w:tblLook w:val="04A0" w:firstRow="1" w:lastRow="0" w:firstColumn="1" w:lastColumn="0" w:noHBand="0" w:noVBand="1"/>
@@ -7556,7 +7556,7 @@
     </w:p>
     <w:tbl>
       <w:tblPr>
-        <w:tblStyle w:val="Grilledutableau"/>
+        <w:tblStyle w:val="TableGrid"/>
         <w:tblW w:w="8268" w:type="dxa"/>
         <w:tblLayout w:type="fixed"/>
         <w:tblLook w:val="04A0" w:firstRow="1" w:lastRow="0" w:firstColumn="1" w:lastColumn="0" w:noHBand="0" w:noVBand="1"/>
@@ -7911,7 +7911,7 @@
     </w:p>
     <w:tbl>
       <w:tblPr>
-        <w:tblStyle w:val="Grilledutableau"/>
+        <w:tblStyle w:val="TableGrid"/>
         <w:tblW w:w="8268" w:type="dxa"/>
         <w:tblLayout w:type="fixed"/>
         <w:tblLook w:val="04A0" w:firstRow="1" w:lastRow="0" w:firstColumn="1" w:lastColumn="0" w:noHBand="0" w:noVBand="1"/>
@@ -10001,7 +10001,7 @@
     </w:p>
     <w:tbl>
       <w:tblPr>
-        <w:tblStyle w:val="Grilledutableau"/>
+        <w:tblStyle w:val="TableGrid"/>
         <w:tblW w:w="8268" w:type="dxa"/>
         <w:tblLayout w:type="fixed"/>
         <w:tblLook w:val="04A0" w:firstRow="1" w:lastRow="0" w:firstColumn="1" w:lastColumn="0" w:noHBand="0" w:noVBand="1"/>
@@ -10904,7 +10904,7 @@
     </w:p>
     <w:p>
       <w:pPr>
-        <w:pStyle w:val="Paragraphedeliste"/>
+        <w:pStyle w:val="ListParagraph"/>
         <w:numPr>
           <w:ilvl w:val="0"/>
           <w:numId w:val="3"/>
@@ -10942,7 +10942,7 @@
     </w:p>
     <w:p>
       <w:pPr>
-        <w:pStyle w:val="Paragraphedeliste"/>
+        <w:pStyle w:val="ListParagraph"/>
         <w:numPr>
           <w:ilvl w:val="0"/>
           <w:numId w:val="3"/>
@@ -10986,7 +10986,7 @@
     </w:p>
     <w:p>
       <w:pPr>
-        <w:pStyle w:val="Paragraphedeliste"/>
+        <w:pStyle w:val="ListParagraph"/>
         <w:numPr>
           <w:ilvl w:val="0"/>
           <w:numId w:val="3"/>
@@ -11038,7 +11038,7 @@
     </w:p>
     <w:p>
       <w:pPr>
-        <w:pStyle w:val="Paragraphedeliste"/>
+        <w:pStyle w:val="ListParagraph"/>
         <w:numPr>
           <w:ilvl w:val="0"/>
           <w:numId w:val="3"/>
@@ -11082,7 +11082,7 @@
     </w:p>
     <w:p>
       <w:pPr>
-        <w:pStyle w:val="Paragraphedeliste"/>
+        <w:pStyle w:val="ListParagraph"/>
         <w:numPr>
           <w:ilvl w:val="0"/>
           <w:numId w:val="3"/>
@@ -11275,7 +11275,7 @@
     </w:p>
     <w:p>
       <w:pPr>
-        <w:pStyle w:val="Paragraphedeliste"/>
+        <w:pStyle w:val="ListParagraph"/>
         <w:numPr>
           <w:ilvl w:val="0"/>
           <w:numId w:val="3"/>
@@ -11342,7 +11342,7 @@
     </w:p>
     <w:p>
       <w:pPr>
-        <w:pStyle w:val="Paragraphedeliste"/>
+        <w:pStyle w:val="ListParagraph"/>
         <w:numPr>
           <w:ilvl w:val="0"/>
           <w:numId w:val="3"/>
@@ -11432,7 +11432,7 @@
     </w:p>
     <w:p>
       <w:pPr>
-        <w:pStyle w:val="Paragraphedeliste"/>
+        <w:pStyle w:val="ListParagraph"/>
         <w:numPr>
           <w:ilvl w:val="0"/>
           <w:numId w:val="3"/>
@@ -11522,7 +11522,7 @@
     </w:p>
     <w:p>
       <w:pPr>
-        <w:pStyle w:val="Paragraphedeliste"/>
+        <w:pStyle w:val="ListParagraph"/>
         <w:numPr>
           <w:ilvl w:val="0"/>
           <w:numId w:val="3"/>
@@ -11605,7 +11605,7 @@
     </w:p>
     <w:p>
       <w:pPr>
-        <w:pStyle w:val="Paragraphedeliste"/>
+        <w:pStyle w:val="ListParagraph"/>
         <w:numPr>
           <w:ilvl w:val="0"/>
           <w:numId w:val="3"/>
@@ -12382,6 +12382,318 @@
         </mc:AlternateContent>
       </w:r>
     </w:p>
+    <w:p>
+      <w:r>
+        <w:br w:type="page"/>
+      </w:r>
+    </w:p>
+    <w:p>
+      <w:pPr>
+        <w:keepLines/>
+        <w:jc w:val="both"/>
+      </w:pPr>
+      <w:r>
+        <w:rPr>
+          <w:rFonts w:cs="TimesNewRomanPSMT"/>
+          <w:szCs w:val="22"/>
+        </w:rPr>
+        <w:lastRenderedPageBreak/>
+        <w:t xml:space="preserve">Le </w:t>
+      </w:r>
+      <w:proofErr w:type="gramStart"/>
+      <w:r>
+        <w:rPr>
+          <w:rFonts w:cs="TimesNewRomanPSMT"/>
+          <w:szCs w:val="22"/>
+        </w:rPr>
+        <w:t>Préfet</w:t>
+      </w:r>
+      <w:proofErr w:type="gramEnd"/>
+      <w:r>
+        <w:rPr>
+          <w:rFonts w:cs="TimesNewRomanPSMT"/>
+          <w:szCs w:val="22"/>
+        </w:rPr>
+        <w:t xml:space="preserve">, ou lorsqu'un établissement public de coopération intercommunale ou un département a signé une convention mentionnée aux articles L.301-5-1 et L.301-5-2, le président de l'établissement public de coopération intercommunale ou du conseil départemental, soussigné certifie la présente copie, établie sur </w:t>
+      </w:r>
+      <w:r>
+        <w:rPr>
+          <w:rFonts w:cs="TimesNewRomanPSMT"/>
+          <w:b/>
+          <w:szCs w:val="22"/>
+        </w:rPr>
+        <w:fldChar w:fldCharType="begin"/>
+      </w:r>
+      <w:r>
+        <w:rPr>
+          <w:rFonts w:cs="TimesNewRomanPSMT"/>
+          <w:b/>
+          <w:szCs w:val="22"/>
+        </w:rPr>
+        <w:instrText xml:space="preserve"> NUMPAGES </w:instrText>
+      </w:r>
+      <w:r>
+        <w:rPr>
+          <w:rFonts w:cs="TimesNewRomanPSMT"/>
+          <w:b/>
+          <w:szCs w:val="22"/>
+        </w:rPr>
+        <w:fldChar w:fldCharType="separate"/>
+      </w:r>
+      <w:r>
+        <w:rPr>
+          <w:rFonts w:cs="TimesNewRomanPSMT"/>
+          <w:b/>
+          <w:noProof/>
+          <w:szCs w:val="22"/>
+        </w:rPr>
+        <w:t>8</w:t>
+      </w:r>
+      <w:r>
+        <w:rPr>
+          <w:rFonts w:cs="TimesNewRomanPSMT"/>
+          <w:b/>
+          <w:szCs w:val="22"/>
+        </w:rPr>
+        <w:fldChar w:fldCharType="end"/>
+      </w:r>
+      <w:r>
+        <w:rPr>
+          <w:rFonts w:cs="TimesNewRomanPSMT"/>
+          <w:szCs w:val="22"/>
+        </w:rPr>
+        <w:t xml:space="preserve"> pages de texte, conforme à la minute et à l'expédition destinée à recevoir la mention de publicité foncière et approuve sans renvoi ou mot rayé.</w:t>
+      </w:r>
+    </w:p>
+    <w:p>
+      <w:pPr>
+        <w:ind w:left="2127" w:right="-6"/>
+        <w:jc w:val="both"/>
+        <w:rPr>
+          <w:rFonts w:cs="TimesNewRomanPSMT"/>
+          <w:szCs w:val="22"/>
+        </w:rPr>
+      </w:pPr>
+    </w:p>
+    <w:p>
+      <w:pPr>
+        <w:keepLines/>
+        <w:jc w:val="both"/>
+      </w:pPr>
+      <w:r>
+        <w:rPr>
+          <w:rFonts w:cs="TimesNewRomanPSMT"/>
+          <w:szCs w:val="22"/>
+        </w:rPr>
+        <w:t xml:space="preserve">Il certifie que l'identité complète des parties dénommées en en-tête du présent document lui a été régulièrement justifiée </w:t>
+      </w:r>
+      <w:r>
+        <w:rPr>
+          <w:rFonts w:cs="TimesNewRomanPSMT"/>
+          <w:szCs w:val="22"/>
+          <w:lang w:eastAsia="fr-FR"/>
+        </w:rPr>
+        <w:t xml:space="preserve">au vu </w:t>
+      </w:r>
+      <w:r>
+        <w:rPr>
+          <w:rFonts w:cs="TimesNewRomanPSMT"/>
+          <w:color w:val="000000"/>
+          <w:szCs w:val="22"/>
+          <w:lang w:eastAsia="fr-FR"/>
+        </w:rPr>
+        <w:t xml:space="preserve">des statuts et de l'avis d'identification délivré par l'INSEE par son numéro SIRET </w:t>
+      </w:r>
+      <w:bookmarkStart w:id="30" w:name="Siret2"/>
+      <w:bookmarkEnd w:id="30"/>
+      <w:proofErr w:type="gramStart"/>
+      <w:r>
+        <w:rPr>
+          <w:rFonts w:cs="TimesNewRomanPSMT"/>
+          <w:color w:val="000000"/>
+          <w:szCs w:val="22"/>
+          <w:lang w:eastAsia="fr-FR"/>
+        </w:rPr>
+        <w:t xml:space="preserve">{{ </w:t>
+      </w:r>
+      <w:proofErr w:type="spellStart"/>
+      <w:r>
+        <w:rPr>
+          <w:rFonts w:cs="TimesNewRomanPSMT"/>
+          <w:color w:val="000000"/>
+          <w:szCs w:val="22"/>
+          <w:lang w:eastAsia="fr-FR"/>
+        </w:rPr>
+        <w:t>bailleur</w:t>
+      </w:r>
+      <w:proofErr w:type="gramEnd"/>
+      <w:r>
+        <w:rPr>
+          <w:rFonts w:cs="TimesNewRomanPSMT"/>
+          <w:color w:val="000000"/>
+          <w:szCs w:val="22"/>
+          <w:lang w:eastAsia="fr-FR"/>
+        </w:rPr>
+        <w:t>_siret</w:t>
+      </w:r>
+      <w:proofErr w:type="spellEnd"/>
+      <w:r>
+        <w:rPr>
+          <w:rFonts w:cs="TimesNewRomanPSMT"/>
+          <w:color w:val="000000"/>
+          <w:szCs w:val="22"/>
+          <w:lang w:eastAsia="fr-FR"/>
+        </w:rPr>
+        <w:t xml:space="preserve"> }}</w:t>
+      </w:r>
+    </w:p>
+    <w:p>
+      <w:pPr>
+        <w:ind w:left="2127" w:right="-6"/>
+        <w:jc w:val="both"/>
+        <w:rPr>
+          <w:rFonts w:cs="TimesNewRomanPSMT"/>
+          <w:color w:val="0000FF"/>
+          <w:szCs w:val="22"/>
+        </w:rPr>
+      </w:pPr>
+    </w:p>
+    <w:p>
+      <w:pPr>
+        <w:keepLines/>
+        <w:jc w:val="both"/>
+      </w:pPr>
+      <w:r>
+        <w:rPr>
+          <w:rFonts w:cs="TimesNewRomanPSMT"/>
+          <w:color w:val="000000"/>
+          <w:szCs w:val="22"/>
+        </w:rPr>
+        <w:t>Pour la perception de la Contribution de Sécurité Immobilière, la restriction au droit de disposer du propriétaire peut être évaluée à la somme de 15 €, étant précisé que la CSI est réduite de moitié en application de l'article 881 L du code général des impôts, lorsque le bailleur est un organisme à loyer modéré.</w:t>
+      </w:r>
+    </w:p>
+    <w:p>
+      <w:pPr>
+        <w:ind w:left="2127" w:right="-6"/>
+        <w:jc w:val="both"/>
+        <w:rPr>
+          <w:rFonts w:cs="TimesNewRomanPSMT"/>
+          <w:color w:val="000000"/>
+          <w:szCs w:val="22"/>
+        </w:rPr>
+      </w:pPr>
+    </w:p>
+    <w:p>
+      <w:pPr>
+        <w:ind w:left="2127" w:right="-6"/>
+        <w:jc w:val="both"/>
+        <w:rPr>
+          <w:rFonts w:cs="TimesNewRomanPSMT"/>
+          <w:color w:val="000000"/>
+          <w:szCs w:val="22"/>
+        </w:rPr>
+      </w:pPr>
+    </w:p>
+    <w:p>
+      <w:pPr>
+        <w:keepLines/>
+        <w:tabs>
+          <w:tab w:val="left" w:pos="9069"/>
+        </w:tabs>
+        <w:ind w:right="283"/>
+        <w:jc w:val="both"/>
+      </w:pPr>
+      <w:r>
+        <w:rPr>
+          <w:rFonts w:cs="TimesNewRomanPSMT"/>
+          <w:color w:val="000000"/>
+          <w:szCs w:val="22"/>
+        </w:rPr>
+        <w:t xml:space="preserve">A </w:t>
+      </w:r>
+      <w:proofErr w:type="gramStart"/>
+      <w:r>
+        <w:rPr>
+          <w:rFonts w:cs="TimesNewRomanPSMT"/>
+        </w:rPr>
+        <w:t xml:space="preserve">{{ </w:t>
+      </w:r>
+      <w:proofErr w:type="spellStart"/>
+      <w:r>
+        <w:rPr>
+          <w:rFonts w:cs="TimesNewRomanPSMT"/>
+        </w:rPr>
+        <w:t>administration.get</w:t>
+      </w:r>
+      <w:proofErr w:type="gramEnd"/>
+      <w:r>
+        <w:rPr>
+          <w:rFonts w:cs="TimesNewRomanPSMT"/>
+        </w:rPr>
+        <w:t>_ville_signature_or_empty</w:t>
+      </w:r>
+      <w:proofErr w:type="spellEnd"/>
+      <w:r>
+        <w:rPr>
+          <w:rFonts w:cs="TimesNewRomanPSMT"/>
+        </w:rPr>
+        <w:t>() }}</w:t>
+      </w:r>
+      <w:r>
+        <w:rPr>
+          <w:rFonts w:cs="TimesNewRomanPSMT"/>
+          <w:color w:val="000000"/>
+          <w:szCs w:val="22"/>
+        </w:rPr>
+        <w:t>, le</w:t>
+      </w:r>
+    </w:p>
+    <w:p>
+      <w:pPr>
+        <w:keepLines/>
+        <w:tabs>
+          <w:tab w:val="left" w:pos="9069"/>
+        </w:tabs>
+        <w:ind w:right="283"/>
+        <w:jc w:val="both"/>
+        <w:rPr>
+          <w:rFonts w:cs="TimesNewRomanPSMT"/>
+          <w:color w:val="000000"/>
+          <w:szCs w:val="22"/>
+        </w:rPr>
+      </w:pPr>
+    </w:p>
+    <w:p>
+      <w:pPr>
+        <w:jc w:val="both"/>
+      </w:pPr>
+      <w:r>
+        <w:rPr>
+          <w:rFonts w:cs="TimesNewRomanPSMT"/>
+        </w:rPr>
+        <w:t xml:space="preserve">Le préfet, le président de l'établissement public de coopération intercommunale, du conseil départemental, de la métropole de Lyon ou du conseil exécutif de Corse, </w:t>
+      </w:r>
+      <w:proofErr w:type="gramStart"/>
+      <w:r>
+        <w:t xml:space="preserve">{{ </w:t>
+      </w:r>
+      <w:proofErr w:type="spellStart"/>
+      <w:r>
+        <w:rPr>
+          <w:rFonts w:cs="TimesNewRomanPSMT"/>
+        </w:rPr>
+        <w:t>administration</w:t>
+      </w:r>
+      <w:proofErr w:type="gramEnd"/>
+      <w:r>
+        <w:t>.signataire_bloc_signature|default_empty_if_none</w:t>
+      </w:r>
+      <w:proofErr w:type="spellEnd"/>
+      <w:r>
+        <w:t xml:space="preserve"> }}</w:t>
+      </w:r>
+    </w:p>
+    <w:p/>
     <w:sectPr>
       <w:headerReference w:type="even" r:id="rId7"/>
       <w:headerReference w:type="default" r:id="rId8"/>
@@ -12429,7 +12741,7 @@
 <w:ftr xmlns:wpc="http://schemas.microsoft.com/office/word/2010/wordprocessingCanvas" xmlns:cx="http://schemas.microsoft.com/office/drawing/2014/chartex" xmlns:cx1="http://schemas.microsoft.com/office/drawing/2015/9/8/chartex" xmlns:cx2="http://schemas.microsoft.com/office/drawing/2015/10/21/chartex" xmlns:cx3="http://schemas.microsoft.com/office/drawing/2016/5/9/chartex" xmlns:cx4="http://schemas.microsoft.com/office/drawing/2016/5/10/chartex" xmlns:cx5="http://schemas.microsoft.com/office/drawing/2016/5/11/chartex" xmlns:cx6="http://schemas.microsoft.com/office/drawing/2016/5/12/chartex" xmlns:cx7="http://schemas.microsoft.com/office/drawing/2016/5/13/chartex" xmlns:cx8="http://schemas.microsoft.com/office/drawing/2016/5/14/chartex" xmlns:mc="http://schemas.openxmlformats.org/markup-compatibility/2006" xmlns:aink="http://schemas.microsoft.com/office/drawing/2016/ink" xmlns:am3d="http://schemas.microsoft.com/office/drawing/2017/model3d" xmlns:o="urn:schemas-microsoft-com:office:office" xmlns:oel="http://schemas.microsoft.com/office/2019/extlst" xmlns:r="http://schemas.openxmlformats.org/officeDocument/2006/relationships" xmlns:m="http://schemas.openxmlformats.org/officeDocument/2006/math" xmlns:v="urn:schemas-microsoft-com:vml" xmlns:wp14="http://schemas.microsoft.com/office/word/2010/wordprocessingDrawing" xmlns:wp="http://schemas.openxmlformats.org/drawingml/2006/wordprocessingDrawing" xmlns:w10="urn:schemas-microsoft-com:office:word" xmlns:w="http://schemas.openxmlformats.org/wordprocessingml/2006/main" xmlns:w14="http://schemas.microsoft.com/office/word/2010/wordml" xmlns:w15="http://schemas.microsoft.com/office/word/2012/wordml" xmlns:w16cex="http://schemas.microsoft.com/office/word/2018/wordml/cex" xmlns:w16cid="http://schemas.microsoft.com/office/word/2016/wordml/cid" xmlns:w16="http://schemas.microsoft.com/office/word/2018/wordml" xmlns:w16du="http://schemas.microsoft.com/office/word/2023/wordml/word16du" xmlns:w16sdtdh="http://schemas.microsoft.com/office/word/2020/wordml/sdtdatahash" xmlns:w16sdtfl="http://schemas.microsoft.com/office/word/2024/wordml/sdtformatlock" xmlns:w16se="http://schemas.microsoft.com/office/word/2015/wordml/symex" xmlns:wpg="http://schemas.microsoft.com/office/word/2010/wordprocessingGroup" xmlns:wpi="http://schemas.microsoft.com/office/word/2010/wordprocessingInk" xmlns:wne="http://schemas.microsoft.com/office/word/2006/wordml" xmlns:wps="http://schemas.microsoft.com/office/word/2010/wordprocessingShape" mc:Ignorable="w14 w15 w16se w16cid w16 w16cex w16sdtdh w16sdtfl w16du wp14">
   <w:p>
     <w:pPr>
-      <w:pStyle w:val="Pieddepage"/>
+      <w:pStyle w:val="Footer"/>
     </w:pPr>
     <w:r>
       <w:t xml:space="preserve"> </w:t>
@@ -12442,7 +12754,7 @@
 <w:ftr xmlns:wpc="http://schemas.microsoft.com/office/word/2010/wordprocessingCanvas" xmlns:cx="http://schemas.microsoft.com/office/drawing/2014/chartex" xmlns:cx1="http://schemas.microsoft.com/office/drawing/2015/9/8/chartex" xmlns:cx2="http://schemas.microsoft.com/office/drawing/2015/10/21/chartex" xmlns:cx3="http://schemas.microsoft.com/office/drawing/2016/5/9/chartex" xmlns:cx4="http://schemas.microsoft.com/office/drawing/2016/5/10/chartex" xmlns:cx5="http://schemas.microsoft.com/office/drawing/2016/5/11/chartex" xmlns:cx6="http://schemas.microsoft.com/office/drawing/2016/5/12/chartex" xmlns:cx7="http://schemas.microsoft.com/office/drawing/2016/5/13/chartex" xmlns:cx8="http://schemas.microsoft.com/office/drawing/2016/5/14/chartex" xmlns:mc="http://schemas.openxmlformats.org/markup-compatibility/2006" xmlns:aink="http://schemas.microsoft.com/office/drawing/2016/ink" xmlns:am3d="http://schemas.microsoft.com/office/drawing/2017/model3d" xmlns:o="urn:schemas-microsoft-com:office:office" xmlns:oel="http://schemas.microsoft.com/office/2019/extlst" xmlns:r="http://schemas.openxmlformats.org/officeDocument/2006/relationships" xmlns:m="http://schemas.openxmlformats.org/officeDocument/2006/math" xmlns:v="urn:schemas-microsoft-com:vml" xmlns:wp14="http://schemas.microsoft.com/office/word/2010/wordprocessingDrawing" xmlns:wp="http://schemas.openxmlformats.org/drawingml/2006/wordprocessingDrawing" xmlns:w10="urn:schemas-microsoft-com:office:word" xmlns:w="http://schemas.openxmlformats.org/wordprocessingml/2006/main" xmlns:w14="http://schemas.microsoft.com/office/word/2010/wordml" xmlns:w15="http://schemas.microsoft.com/office/word/2012/wordml" xmlns:w16cex="http://schemas.microsoft.com/office/word/2018/wordml/cex" xmlns:w16cid="http://schemas.microsoft.com/office/word/2016/wordml/cid" xmlns:w16="http://schemas.microsoft.com/office/word/2018/wordml" xmlns:w16du="http://schemas.microsoft.com/office/word/2023/wordml/word16du" xmlns:w16sdtdh="http://schemas.microsoft.com/office/word/2020/wordml/sdtdatahash" xmlns:w16sdtfl="http://schemas.microsoft.com/office/word/2024/wordml/sdtformatlock" xmlns:w16se="http://schemas.microsoft.com/office/word/2015/wordml/symex" xmlns:wpg="http://schemas.microsoft.com/office/word/2010/wordprocessingGroup" xmlns:wpi="http://schemas.microsoft.com/office/word/2010/wordprocessingInk" xmlns:wne="http://schemas.microsoft.com/office/word/2006/wordml" xmlns:wps="http://schemas.microsoft.com/office/word/2010/wordprocessingShape" mc:Ignorable="w14 w15 w16se w16cid w16 w16cex w16sdtdh w16sdtfl w16du wp14">
   <w:p>
     <w:pPr>
-      <w:pStyle w:val="Pieddepage"/>
+      <w:pStyle w:val="Footer"/>
     </w:pPr>
     <w:r>
       <w:t xml:space="preserve"> </w:t>
@@ -12455,7 +12767,7 @@
 <w:ftr xmlns:wpc="http://schemas.microsoft.com/office/word/2010/wordprocessingCanvas" xmlns:cx="http://schemas.microsoft.com/office/drawing/2014/chartex" xmlns:cx1="http://schemas.microsoft.com/office/drawing/2015/9/8/chartex" xmlns:cx2="http://schemas.microsoft.com/office/drawing/2015/10/21/chartex" xmlns:cx3="http://schemas.microsoft.com/office/drawing/2016/5/9/chartex" xmlns:cx4="http://schemas.microsoft.com/office/drawing/2016/5/10/chartex" xmlns:cx5="http://schemas.microsoft.com/office/drawing/2016/5/11/chartex" xmlns:cx6="http://schemas.microsoft.com/office/drawing/2016/5/12/chartex" xmlns:cx7="http://schemas.microsoft.com/office/drawing/2016/5/13/chartex" xmlns:cx8="http://schemas.microsoft.com/office/drawing/2016/5/14/chartex" xmlns:mc="http://schemas.openxmlformats.org/markup-compatibility/2006" xmlns:aink="http://schemas.microsoft.com/office/drawing/2016/ink" xmlns:am3d="http://schemas.microsoft.com/office/drawing/2017/model3d" xmlns:o="urn:schemas-microsoft-com:office:office" xmlns:oel="http://schemas.microsoft.com/office/2019/extlst" xmlns:r="http://schemas.openxmlformats.org/officeDocument/2006/relationships" xmlns:m="http://schemas.openxmlformats.org/officeDocument/2006/math" xmlns:v="urn:schemas-microsoft-com:vml" xmlns:wp14="http://schemas.microsoft.com/office/word/2010/wordprocessingDrawing" xmlns:wp="http://schemas.openxmlformats.org/drawingml/2006/wordprocessingDrawing" xmlns:w10="urn:schemas-microsoft-com:office:word" xmlns:w="http://schemas.openxmlformats.org/wordprocessingml/2006/main" xmlns:w14="http://schemas.microsoft.com/office/word/2010/wordml" xmlns:w15="http://schemas.microsoft.com/office/word/2012/wordml" xmlns:w16cex="http://schemas.microsoft.com/office/word/2018/wordml/cex" xmlns:w16cid="http://schemas.microsoft.com/office/word/2016/wordml/cid" xmlns:w16="http://schemas.microsoft.com/office/word/2018/wordml" xmlns:w16du="http://schemas.microsoft.com/office/word/2023/wordml/word16du" xmlns:w16sdtdh="http://schemas.microsoft.com/office/word/2020/wordml/sdtdatahash" xmlns:w16sdtfl="http://schemas.microsoft.com/office/word/2024/wordml/sdtformatlock" xmlns:w16se="http://schemas.microsoft.com/office/word/2015/wordml/symex" xmlns:wpg="http://schemas.microsoft.com/office/word/2010/wordprocessingGroup" xmlns:wpi="http://schemas.microsoft.com/office/word/2010/wordprocessingInk" xmlns:wne="http://schemas.microsoft.com/office/word/2006/wordml" xmlns:wps="http://schemas.microsoft.com/office/word/2010/wordprocessingShape" mc:Ignorable="w14 w15 w16se w16cid w16 w16cex w16sdtdh w16sdtfl w16du wp14">
   <w:p>
     <w:pPr>
-      <w:pStyle w:val="Pieddepage"/>
+      <w:pStyle w:val="Footer"/>
     </w:pPr>
     <w:r>
       <w:t xml:space="preserve"> </w:t>
@@ -12487,7 +12799,7 @@
 <w:hdr xmlns:wpc="http://schemas.microsoft.com/office/word/2010/wordprocessingCanvas" xmlns:cx="http://schemas.microsoft.com/office/drawing/2014/chartex" xmlns:cx1="http://schemas.microsoft.com/office/drawing/2015/9/8/chartex" xmlns:cx2="http://schemas.microsoft.com/office/drawing/2015/10/21/chartex" xmlns:cx3="http://schemas.microsoft.com/office/drawing/2016/5/9/chartex" xmlns:cx4="http://schemas.microsoft.com/office/drawing/2016/5/10/chartex" xmlns:cx5="http://schemas.microsoft.com/office/drawing/2016/5/11/chartex" xmlns:cx6="http://schemas.microsoft.com/office/drawing/2016/5/12/chartex" xmlns:cx7="http://schemas.microsoft.com/office/drawing/2016/5/13/chartex" xmlns:cx8="http://schemas.microsoft.com/office/drawing/2016/5/14/chartex" xmlns:mc="http://schemas.openxmlformats.org/markup-compatibility/2006" xmlns:aink="http://schemas.microsoft.com/office/drawing/2016/ink" xmlns:am3d="http://schemas.microsoft.com/office/drawing/2017/model3d" xmlns:o="urn:schemas-microsoft-com:office:office" xmlns:oel="http://schemas.microsoft.com/office/2019/extlst" xmlns:r="http://schemas.openxmlformats.org/officeDocument/2006/relationships" xmlns:m="http://schemas.openxmlformats.org/officeDocument/2006/math" xmlns:v="urn:schemas-microsoft-com:vml" xmlns:wp14="http://schemas.microsoft.com/office/word/2010/wordprocessingDrawing" xmlns:wp="http://schemas.openxmlformats.org/drawingml/2006/wordprocessingDrawing" xmlns:w10="urn:schemas-microsoft-com:office:word" xmlns:w="http://schemas.openxmlformats.org/wordprocessingml/2006/main" xmlns:w14="http://schemas.microsoft.com/office/word/2010/wordml" xmlns:w15="http://schemas.microsoft.com/office/word/2012/wordml" xmlns:w16cex="http://schemas.microsoft.com/office/word/2018/wordml/cex" xmlns:w16cid="http://schemas.microsoft.com/office/word/2016/wordml/cid" xmlns:w16="http://schemas.microsoft.com/office/word/2018/wordml" xmlns:w16du="http://schemas.microsoft.com/office/word/2023/wordml/word16du" xmlns:w16sdtdh="http://schemas.microsoft.com/office/word/2020/wordml/sdtdatahash" xmlns:w16sdtfl="http://schemas.microsoft.com/office/word/2024/wordml/sdtformatlock" xmlns:w16se="http://schemas.microsoft.com/office/word/2015/wordml/symex" xmlns:wpg="http://schemas.microsoft.com/office/word/2010/wordprocessingGroup" xmlns:wpi="http://schemas.microsoft.com/office/word/2010/wordprocessingInk" xmlns:wne="http://schemas.microsoft.com/office/word/2006/wordml" xmlns:wps="http://schemas.microsoft.com/office/word/2010/wordprocessingShape" mc:Ignorable="w14 w15 w16se w16cid w16 w16cex w16sdtdh w16sdtfl w16du wp14">
   <w:p>
     <w:pPr>
-      <w:pStyle w:val="En-tte"/>
+      <w:pStyle w:val="Header"/>
     </w:pPr>
     <w:r>
       <w:pict w14:anchorId="36790DC3">
@@ -12568,7 +12880,7 @@
                           </w:pPr>
                           <w:r>
                             <w:rPr>
-                              <w:rStyle w:val="Numrodepage"/>
+                              <w:rStyle w:val="PageNumber"/>
                               <w:sz w:val="22"/>
                               <w:szCs w:val="22"/>
                             </w:rPr>
@@ -12576,7 +12888,7 @@
                           </w:r>
                           <w:r>
                             <w:rPr>
-                              <w:rStyle w:val="Numrodepage"/>
+                              <w:rStyle w:val="PageNumber"/>
                               <w:sz w:val="22"/>
                               <w:szCs w:val="22"/>
                             </w:rPr>
@@ -12584,7 +12896,7 @@
                           </w:r>
                           <w:r>
                             <w:rPr>
-                              <w:rStyle w:val="Numrodepage"/>
+                              <w:rStyle w:val="PageNumber"/>
                               <w:sz w:val="22"/>
                               <w:szCs w:val="22"/>
                             </w:rPr>
@@ -12592,7 +12904,7 @@
                           </w:r>
                           <w:r>
                             <w:rPr>
-                              <w:rStyle w:val="Numrodepage"/>
+                              <w:rStyle w:val="PageNumber"/>
                               <w:sz w:val="22"/>
                               <w:szCs w:val="22"/>
                             </w:rPr>
@@ -12600,7 +12912,7 @@
                           </w:r>
                           <w:r>
                             <w:rPr>
-                              <w:rStyle w:val="Numrodepage"/>
+                              <w:rStyle w:val="PageNumber"/>
                               <w:sz w:val="22"/>
                               <w:szCs w:val="22"/>
                             </w:rPr>
@@ -12608,7 +12920,7 @@
                           </w:r>
                           <w:r>
                             <w:rPr>
-                              <w:rStyle w:val="Numrodepage"/>
+                              <w:rStyle w:val="PageNumber"/>
                               <w:sz w:val="22"/>
                               <w:szCs w:val="22"/>
                             </w:rPr>
@@ -12703,7 +13015,7 @@
 <w:hdr xmlns:wpc="http://schemas.microsoft.com/office/word/2010/wordprocessingCanvas" xmlns:cx="http://schemas.microsoft.com/office/drawing/2014/chartex" xmlns:cx1="http://schemas.microsoft.com/office/drawing/2015/9/8/chartex" xmlns:cx2="http://schemas.microsoft.com/office/drawing/2015/10/21/chartex" xmlns:cx3="http://schemas.microsoft.com/office/drawing/2016/5/9/chartex" xmlns:cx4="http://schemas.microsoft.com/office/drawing/2016/5/10/chartex" xmlns:cx5="http://schemas.microsoft.com/office/drawing/2016/5/11/chartex" xmlns:cx6="http://schemas.microsoft.com/office/drawing/2016/5/12/chartex" xmlns:cx7="http://schemas.microsoft.com/office/drawing/2016/5/13/chartex" xmlns:cx8="http://schemas.microsoft.com/office/drawing/2016/5/14/chartex" xmlns:mc="http://schemas.openxmlformats.org/markup-compatibility/2006" xmlns:aink="http://schemas.microsoft.com/office/drawing/2016/ink" xmlns:am3d="http://schemas.microsoft.com/office/drawing/2017/model3d" xmlns:o="urn:schemas-microsoft-com:office:office" xmlns:oel="http://schemas.microsoft.com/office/2019/extlst" xmlns:r="http://schemas.openxmlformats.org/officeDocument/2006/relationships" xmlns:m="http://schemas.openxmlformats.org/officeDocument/2006/math" xmlns:v="urn:schemas-microsoft-com:vml" xmlns:wp14="http://schemas.microsoft.com/office/word/2010/wordprocessingDrawing" xmlns:wp="http://schemas.openxmlformats.org/drawingml/2006/wordprocessingDrawing" xmlns:w10="urn:schemas-microsoft-com:office:word" xmlns:w="http://schemas.openxmlformats.org/wordprocessingml/2006/main" xmlns:w14="http://schemas.microsoft.com/office/word/2010/wordml" xmlns:w15="http://schemas.microsoft.com/office/word/2012/wordml" xmlns:w16cex="http://schemas.microsoft.com/office/word/2018/wordml/cex" xmlns:w16cid="http://schemas.microsoft.com/office/word/2016/wordml/cid" xmlns:w16="http://schemas.microsoft.com/office/word/2018/wordml" xmlns:w16du="http://schemas.microsoft.com/office/word/2023/wordml/word16du" xmlns:w16sdtdh="http://schemas.microsoft.com/office/word/2020/wordml/sdtdatahash" xmlns:w16sdtfl="http://schemas.microsoft.com/office/word/2024/wordml/sdtformatlock" xmlns:w16se="http://schemas.microsoft.com/office/word/2015/wordml/symex" xmlns:wpg="http://schemas.microsoft.com/office/word/2010/wordprocessingGroup" xmlns:wpi="http://schemas.microsoft.com/office/word/2010/wordprocessingInk" xmlns:wne="http://schemas.microsoft.com/office/word/2006/wordml" xmlns:wps="http://schemas.microsoft.com/office/word/2010/wordprocessingShape" mc:Ignorable="w14 w15 w16se w16cid w16 w16cex w16sdtdh w16sdtfl w16du wp14">
   <w:p>
     <w:pPr>
-      <w:pStyle w:val="En-tte"/>
+      <w:pStyle w:val="Header"/>
       <w:ind w:right="360"/>
     </w:pPr>
     <w:r>
@@ -12775,7 +13087,7 @@
                           </w:pPr>
                           <w:r>
                             <w:rPr>
-                              <w:rStyle w:val="Numrodepage"/>
+                              <w:rStyle w:val="PageNumber"/>
                               <w:sz w:val="22"/>
                               <w:szCs w:val="22"/>
                             </w:rPr>
@@ -12783,7 +13095,7 @@
                           </w:r>
                           <w:r>
                             <w:rPr>
-                              <w:rStyle w:val="Numrodepage"/>
+                              <w:rStyle w:val="PageNumber"/>
                               <w:sz w:val="22"/>
                               <w:szCs w:val="22"/>
                             </w:rPr>
@@ -12791,7 +13103,7 @@
                           </w:r>
                           <w:r>
                             <w:rPr>
-                              <w:rStyle w:val="Numrodepage"/>
+                              <w:rStyle w:val="PageNumber"/>
                               <w:sz w:val="22"/>
                               <w:szCs w:val="22"/>
                             </w:rPr>
@@ -12799,7 +13111,7 @@
                           </w:r>
                           <w:r>
                             <w:rPr>
-                              <w:rStyle w:val="Numrodepage"/>
+                              <w:rStyle w:val="PageNumber"/>
                               <w:sz w:val="22"/>
                               <w:szCs w:val="22"/>
                             </w:rPr>
@@ -12807,7 +13119,7 @@
                           </w:r>
                           <w:r>
                             <w:rPr>
-                              <w:rStyle w:val="Numrodepage"/>
+                              <w:rStyle w:val="PageNumber"/>
                               <w:sz w:val="22"/>
                               <w:szCs w:val="22"/>
                             </w:rPr>
@@ -12815,7 +13127,7 @@
                           </w:r>
                           <w:r>
                             <w:rPr>
-                              <w:rStyle w:val="Numrodepage"/>
+                              <w:rStyle w:val="PageNumber"/>
                               <w:sz w:val="22"/>
                               <w:szCs w:val="22"/>
                             </w:rPr>
@@ -12823,7 +13135,7 @@
                           </w:r>
                           <w:r>
                             <w:rPr>
-                              <w:rStyle w:val="Numrodepage"/>
+                              <w:rStyle w:val="PageNumber"/>
                             </w:rPr>
                             <w:t xml:space="preserve"> </w:t>
                           </w:r>
@@ -12916,25 +13228,25 @@
     </w:r>
     <w:r>
       <w:rPr>
-        <w:rStyle w:val="Numrodepage"/>
+        <w:rStyle w:val="PageNumber"/>
       </w:rPr>
       <w:t xml:space="preserve"> </w:t>
     </w:r>
     <w:r>
       <w:rPr>
-        <w:rStyle w:val="Numrodepage"/>
+        <w:rStyle w:val="PageNumber"/>
       </w:rPr>
       <w:tab/>
     </w:r>
     <w:r>
       <w:rPr>
-        <w:rStyle w:val="Numrodepage"/>
+        <w:rStyle w:val="PageNumber"/>
       </w:rPr>
       <w:tab/>
     </w:r>
     <w:r>
       <w:rPr>
-        <w:rStyle w:val="Numrodepage"/>
+        <w:rStyle w:val="PageNumber"/>
       </w:rPr>
       <w:tab/>
     </w:r>
@@ -12946,7 +13258,7 @@
 <w:hdr xmlns:wpc="http://schemas.microsoft.com/office/word/2010/wordprocessingCanvas" xmlns:cx="http://schemas.microsoft.com/office/drawing/2014/chartex" xmlns:cx1="http://schemas.microsoft.com/office/drawing/2015/9/8/chartex" xmlns:cx2="http://schemas.microsoft.com/office/drawing/2015/10/21/chartex" xmlns:cx3="http://schemas.microsoft.com/office/drawing/2016/5/9/chartex" xmlns:cx4="http://schemas.microsoft.com/office/drawing/2016/5/10/chartex" xmlns:cx5="http://schemas.microsoft.com/office/drawing/2016/5/11/chartex" xmlns:cx6="http://schemas.microsoft.com/office/drawing/2016/5/12/chartex" xmlns:cx7="http://schemas.microsoft.com/office/drawing/2016/5/13/chartex" xmlns:cx8="http://schemas.microsoft.com/office/drawing/2016/5/14/chartex" xmlns:mc="http://schemas.openxmlformats.org/markup-compatibility/2006" xmlns:aink="http://schemas.microsoft.com/office/drawing/2016/ink" xmlns:am3d="http://schemas.microsoft.com/office/drawing/2017/model3d" xmlns:o="urn:schemas-microsoft-com:office:office" xmlns:oel="http://schemas.microsoft.com/office/2019/extlst" xmlns:r="http://schemas.openxmlformats.org/officeDocument/2006/relationships" xmlns:m="http://schemas.openxmlformats.org/officeDocument/2006/math" xmlns:v="urn:schemas-microsoft-com:vml" xmlns:wp14="http://schemas.microsoft.com/office/word/2010/wordprocessingDrawing" xmlns:wp="http://schemas.openxmlformats.org/drawingml/2006/wordprocessingDrawing" xmlns:w10="urn:schemas-microsoft-com:office:word" xmlns:w="http://schemas.openxmlformats.org/wordprocessingml/2006/main" xmlns:w14="http://schemas.microsoft.com/office/word/2010/wordml" xmlns:w15="http://schemas.microsoft.com/office/word/2012/wordml" xmlns:w16cex="http://schemas.microsoft.com/office/word/2018/wordml/cex" xmlns:w16cid="http://schemas.microsoft.com/office/word/2016/wordml/cid" xmlns:w16="http://schemas.microsoft.com/office/word/2018/wordml" xmlns:w16du="http://schemas.microsoft.com/office/word/2023/wordml/word16du" xmlns:w16sdtdh="http://schemas.microsoft.com/office/word/2020/wordml/sdtdatahash" xmlns:w16sdtfl="http://schemas.microsoft.com/office/word/2024/wordml/sdtformatlock" xmlns:w16se="http://schemas.microsoft.com/office/word/2015/wordml/symex" xmlns:wpg="http://schemas.microsoft.com/office/word/2010/wordprocessingGroup" xmlns:wpi="http://schemas.microsoft.com/office/word/2010/wordprocessingInk" xmlns:wne="http://schemas.microsoft.com/office/word/2006/wordml" xmlns:wps="http://schemas.microsoft.com/office/word/2010/wordprocessingShape" mc:Ignorable="w14 w15 w16se w16cid w16 w16cex w16sdtdh w16sdtfl w16du wp14">
   <w:tbl>
     <w:tblPr>
-      <w:tblStyle w:val="Grilledutableau"/>
+      <w:tblStyle w:val="TableGrid"/>
       <w:tblW w:w="8460" w:type="dxa"/>
       <w:jc w:val="center"/>
       <w:tblLayout w:type="fixed"/>
@@ -13452,7 +13764,7 @@
   </w:tbl>
   <w:p>
     <w:pPr>
-      <w:pStyle w:val="En-tte"/>
+      <w:pStyle w:val="Header"/>
       <w:tabs>
         <w:tab w:val="clear" w:pos="4536"/>
         <w:tab w:val="clear" w:pos="9072"/>
@@ -14087,7 +14399,7 @@
     <w:lvl w:ilvl="0">
       <w:start w:val="1"/>
       <w:numFmt w:val="none"/>
-      <w:pStyle w:val="Titre1"/>
+      <w:pStyle w:val="Heading1"/>
       <w:suff w:val="nothing"/>
       <w:lvlText w:val=""/>
       <w:lvlJc w:val="left"/>
@@ -14101,7 +14413,7 @@
     <w:lvl w:ilvl="1">
       <w:start w:val="1"/>
       <w:numFmt w:val="none"/>
-      <w:pStyle w:val="Titre2"/>
+      <w:pStyle w:val="Heading2"/>
       <w:suff w:val="nothing"/>
       <w:lvlText w:val=""/>
       <w:lvlJc w:val="left"/>
@@ -14128,7 +14440,7 @@
     <w:lvl w:ilvl="3">
       <w:start w:val="1"/>
       <w:numFmt w:val="none"/>
-      <w:pStyle w:val="Titre4"/>
+      <w:pStyle w:val="Heading4"/>
       <w:suff w:val="nothing"/>
       <w:lvlText w:val=""/>
       <w:lvlJc w:val="left"/>
@@ -14142,7 +14454,7 @@
     <w:lvl w:ilvl="4">
       <w:start w:val="1"/>
       <w:numFmt w:val="none"/>
-      <w:pStyle w:val="Titre5"/>
+      <w:pStyle w:val="Heading5"/>
       <w:suff w:val="nothing"/>
       <w:lvlText w:val=""/>
       <w:lvlJc w:val="left"/>
@@ -14156,7 +14468,7 @@
     <w:lvl w:ilvl="5">
       <w:start w:val="1"/>
       <w:numFmt w:val="none"/>
-      <w:pStyle w:val="Titre6"/>
+      <w:pStyle w:val="Heading6"/>
       <w:suff w:val="nothing"/>
       <w:lvlText w:val=""/>
       <w:lvlJc w:val="left"/>
@@ -14170,7 +14482,7 @@
     <w:lvl w:ilvl="6">
       <w:start w:val="1"/>
       <w:numFmt w:val="none"/>
-      <w:pStyle w:val="Titre7"/>
+      <w:pStyle w:val="Heading7"/>
       <w:suff w:val="nothing"/>
       <w:lvlText w:val=""/>
       <w:lvlJc w:val="left"/>
@@ -14887,7 +15199,7 @@
       <w:szCs w:val="24"/>
     </w:rPr>
   </w:style>
-  <w:style w:type="paragraph" w:styleId="Titre1">
+  <w:style w:type="paragraph" w:styleId="Heading1">
     <w:name w:val="heading 1"/>
     <w:basedOn w:val="Normal"/>
     <w:next w:val="Normal"/>
@@ -14917,7 +15229,7 @@
       <w:lang w:eastAsia="zh-CN"/>
     </w:rPr>
   </w:style>
-  <w:style w:type="paragraph" w:styleId="Titre2">
+  <w:style w:type="paragraph" w:styleId="Heading2">
     <w:name w:val="heading 2"/>
     <w:basedOn w:val="Normal"/>
     <w:next w:val="Normal"/>
@@ -14941,9 +15253,9 @@
       <w:lang w:eastAsia="zh-CN"/>
     </w:rPr>
   </w:style>
-  <w:style w:type="paragraph" w:styleId="Titre3">
+  <w:style w:type="paragraph" w:styleId="Heading3">
     <w:name w:val="heading 3"/>
-    <w:basedOn w:val="Titre2"/>
+    <w:basedOn w:val="Heading2"/>
     <w:next w:val="Normal"/>
     <w:qFormat/>
     <w:pPr>
@@ -14953,7 +15265,7 @@
       <w:color w:val="800080"/>
     </w:rPr>
   </w:style>
-  <w:style w:type="paragraph" w:styleId="Titre4">
+  <w:style w:type="paragraph" w:styleId="Heading4">
     <w:name w:val="heading 4"/>
     <w:basedOn w:val="Normal"/>
     <w:next w:val="Normal"/>
@@ -14974,7 +15286,7 @@
       <w:lang w:eastAsia="zh-CN"/>
     </w:rPr>
   </w:style>
-  <w:style w:type="paragraph" w:styleId="Titre5">
+  <w:style w:type="paragraph" w:styleId="Heading5">
     <w:name w:val="heading 5"/>
     <w:basedOn w:val="Normal"/>
     <w:next w:val="Normal"/>
@@ -14995,7 +15307,7 @@
       <w:lang w:eastAsia="zh-CN"/>
     </w:rPr>
   </w:style>
-  <w:style w:type="paragraph" w:styleId="Titre6">
+  <w:style w:type="paragraph" w:styleId="Heading6">
     <w:name w:val="heading 6"/>
     <w:basedOn w:val="Normal"/>
     <w:next w:val="Normal"/>
@@ -15017,7 +15329,7 @@
       <w:lang w:eastAsia="zh-CN"/>
     </w:rPr>
   </w:style>
-  <w:style w:type="paragraph" w:styleId="Titre7">
+  <w:style w:type="paragraph" w:styleId="Heading7">
     <w:name w:val="heading 7"/>
     <w:basedOn w:val="Normal"/>
     <w:next w:val="Normal"/>
@@ -15040,13 +15352,13 @@
       <w:lang w:eastAsia="zh-CN"/>
     </w:rPr>
   </w:style>
-  <w:style w:type="character" w:default="1" w:styleId="Policepardfaut">
+  <w:style w:type="character" w:default="1" w:styleId="DefaultParagraphFont">
     <w:name w:val="Default Paragraph Font"/>
     <w:uiPriority w:val="1"/>
     <w:semiHidden/>
     <w:unhideWhenUsed/>
   </w:style>
-  <w:style w:type="table" w:default="1" w:styleId="TableauNormal">
+  <w:style w:type="table" w:default="1" w:styleId="TableNormal">
     <w:name w:val="Normal Table"/>
     <w:uiPriority w:val="99"/>
     <w:semiHidden/>
@@ -15061,7 +15373,7 @@
       </w:tblCellMar>
     </w:tblPr>
   </w:style>
-  <w:style w:type="numbering" w:default="1" w:styleId="Aucuneliste">
+  <w:style w:type="numbering" w:default="1" w:styleId="NoList">
     <w:name w:val="No List"/>
     <w:uiPriority w:val="99"/>
     <w:semiHidden/>
@@ -15324,7 +15636,7 @@
     <w:name w:val="WW-Police par défaut"/>
     <w:qFormat/>
   </w:style>
-  <w:style w:type="character" w:styleId="Numrodepage">
+  <w:style w:type="character" w:styleId="PageNumber">
     <w:name w:val="page number"/>
     <w:basedOn w:val="WW-Policepardfaut"/>
     <w:qFormat/>
@@ -15401,7 +15713,7 @@
   <w:style w:type="paragraph" w:customStyle="1" w:styleId="Heading">
     <w:name w:val="Heading"/>
     <w:basedOn w:val="Normal"/>
-    <w:next w:val="Corpsdetexte"/>
+    <w:next w:val="BodyText"/>
     <w:qFormat/>
     <w:pPr>
       <w:keepNext/>
@@ -15413,7 +15725,7 @@
       <w:szCs w:val="28"/>
     </w:rPr>
   </w:style>
-  <w:style w:type="paragraph" w:styleId="Corpsdetexte">
+  <w:style w:type="paragraph" w:styleId="BodyText">
     <w:name w:val="Body Text"/>
     <w:basedOn w:val="Normal"/>
     <w:pPr>
@@ -15426,14 +15738,14 @@
       <w:lang w:eastAsia="zh-CN"/>
     </w:rPr>
   </w:style>
-  <w:style w:type="paragraph" w:styleId="Liste">
+  <w:style w:type="paragraph" w:styleId="List">
     <w:name w:val="List"/>
-    <w:basedOn w:val="Corpsdetexte"/>
+    <w:basedOn w:val="BodyText"/>
     <w:rPr>
       <w:rFonts w:cs="Tahoma"/>
     </w:rPr>
   </w:style>
-  <w:style w:type="paragraph" w:styleId="Lgende">
+  <w:style w:type="paragraph" w:styleId="Caption">
     <w:name w:val="caption"/>
     <w:basedOn w:val="Normal"/>
     <w:qFormat/>
@@ -15464,10 +15776,10 @@
       <w:lang w:eastAsia="zh-CN"/>
     </w:rPr>
   </w:style>
-  <w:style w:type="paragraph" w:customStyle="1" w:styleId="Titre20">
+  <w:style w:type="paragraph" w:customStyle="1" w:styleId="Titre2">
     <w:name w:val="Titre2"/>
     <w:basedOn w:val="Normal"/>
-    <w:next w:val="Corpsdetexte"/>
+    <w:next w:val="BodyText"/>
     <w:qFormat/>
     <w:pPr>
       <w:keepNext/>
@@ -15500,7 +15812,7 @@
   <w:style w:type="paragraph" w:customStyle="1" w:styleId="WW-Titre">
     <w:name w:val="WW-Titre"/>
     <w:basedOn w:val="Normal"/>
-    <w:next w:val="Corpsdetexte"/>
+    <w:next w:val="BodyText"/>
     <w:qFormat/>
     <w:pPr>
       <w:keepNext/>
@@ -15515,10 +15827,10 @@
       <w:lang w:eastAsia="zh-CN"/>
     </w:rPr>
   </w:style>
-  <w:style w:type="paragraph" w:styleId="Sous-titre">
+  <w:style w:type="paragraph" w:styleId="Subtitle">
     <w:name w:val="Subtitle"/>
-    <w:basedOn w:val="Titre20"/>
-    <w:next w:val="Corpsdetexte"/>
+    <w:basedOn w:val="Titre2"/>
+    <w:next w:val="BodyText"/>
     <w:qFormat/>
     <w:pPr>
       <w:jc w:val="center"/>
@@ -15548,7 +15860,7 @@
     <w:basedOn w:val="Normal"/>
     <w:qFormat/>
   </w:style>
-  <w:style w:type="paragraph" w:styleId="En-tte">
+  <w:style w:type="paragraph" w:styleId="Header">
     <w:name w:val="header"/>
     <w:basedOn w:val="Normal"/>
     <w:pPr>
@@ -15564,7 +15876,7 @@
       <w:lang w:eastAsia="zh-CN"/>
     </w:rPr>
   </w:style>
-  <w:style w:type="paragraph" w:styleId="Pieddepage">
+  <w:style w:type="paragraph" w:styleId="Footer">
     <w:name w:val="footer"/>
     <w:basedOn w:val="Normal"/>
     <w:pPr>
@@ -15674,7 +15986,7 @@
       <w:lang w:eastAsia="zh-CN"/>
     </w:rPr>
   </w:style>
-  <w:style w:type="paragraph" w:styleId="Notedebasdepage">
+  <w:style w:type="paragraph" w:styleId="FootnoteText">
     <w:name w:val="footnote text"/>
     <w:basedOn w:val="Normal"/>
     <w:pPr>
@@ -15838,7 +16150,7 @@
   </w:style>
   <w:style w:type="paragraph" w:customStyle="1" w:styleId="Contenudetableau">
     <w:name w:val="Contenu de tableau"/>
-    <w:basedOn w:val="Corpsdetexte"/>
+    <w:basedOn w:val="BodyText"/>
     <w:qFormat/>
     <w:pPr>
       <w:suppressLineNumbers/>
@@ -15918,7 +16230,7 @@
       <w:iCs/>
     </w:rPr>
   </w:style>
-  <w:style w:type="paragraph" w:customStyle="1" w:styleId="TITRE40">
+  <w:style w:type="paragraph" w:customStyle="1" w:styleId="TITRE4">
     <w:name w:val="TITRE4"/>
     <w:basedOn w:val="Normal"/>
     <w:qFormat/>
@@ -15933,7 +16245,7 @@
       <w:lang w:eastAsia="zh-CN"/>
     </w:rPr>
   </w:style>
-  <w:style w:type="paragraph" w:customStyle="1" w:styleId="TITRE50">
+  <w:style w:type="paragraph" w:customStyle="1" w:styleId="TITRE5">
     <w:name w:val="TITRE5"/>
     <w:basedOn w:val="Normal"/>
     <w:qFormat/>
@@ -15981,13 +16293,13 @@
   </w:style>
   <w:style w:type="paragraph" w:customStyle="1" w:styleId="Contenuducadre">
     <w:name w:val="Contenu du cadre"/>
-    <w:basedOn w:val="Corpsdetexte"/>
+    <w:basedOn w:val="BodyText"/>
     <w:qFormat/>
   </w:style>
-  <w:style w:type="paragraph" w:customStyle="1" w:styleId="Titre10">
+  <w:style w:type="paragraph" w:customStyle="1" w:styleId="Titre1">
     <w:name w:val="Titre1"/>
     <w:basedOn w:val="Normal"/>
-    <w:next w:val="Corpsdetexte"/>
+    <w:next w:val="BodyText"/>
     <w:qFormat/>
     <w:pPr>
       <w:keepNext/>
@@ -16066,7 +16378,7 @@
       <w:lang w:eastAsia="zh-CN"/>
     </w:rPr>
   </w:style>
-  <w:style w:type="paragraph" w:styleId="Paragraphedeliste">
+  <w:style w:type="paragraph" w:styleId="ListParagraph">
     <w:name w:val="List Paragraph"/>
     <w:basedOn w:val="Normal"/>
     <w:uiPriority w:val="34"/>
@@ -16082,9 +16394,9 @@
     <w:basedOn w:val="Normal"/>
     <w:qFormat/>
   </w:style>
-  <w:style w:type="table" w:styleId="Grilledutableau">
+  <w:style w:type="table" w:styleId="TableGrid">
     <w:name w:val="Table Grid"/>
-    <w:basedOn w:val="TableauNormal"/>
+    <w:basedOn w:val="TableNormal"/>
     <w:uiPriority w:val="59"/>
     <w:rsid w:val="00ED0284"/>
     <w:tblPr>

</xml_diff>